<commit_message>
fix: se actualiza con nuevas variables
</commit_message>
<xml_diff>
--- a/MCDI504/docs/MCDI504_S2_1_GRUPO5.docx
+++ b/MCDI504/docs/MCDI504_S2_1_GRUPO5.docx
@@ -8,7 +8,7 @@
           <w:noProof/>
         </w:rPr>
         <w:drawing>
-          <wp:inline distT="0" distB="0" distL="0" distR="0" wp14:anchorId="4ECF346F" wp14:editId="7E1B56F2">
+          <wp:inline distT="0" distB="0" distL="0" distR="0" wp14:anchorId="0A6B84BF" wp14:editId="59D03C4C">
             <wp:extent cx="1828800" cy="612216"/>
             <wp:effectExtent l="0" t="0" r="0" b="0"/>
             <wp:docPr id="1" name="Picture 1"/>
@@ -146,10 +146,10 @@
         <w:t>:</w:t>
       </w:r>
       <w:r>
-        <w:t xml:space="preserve"> </w:t>
-      </w:r>
-      <w:r>
-        <w:t>David Ruete</w:t>
+        <w:rPr>
+          <w:b/>
+        </w:rPr>
+        <w:t xml:space="preserve"> David Ruete</w:t>
       </w:r>
     </w:p>
     <w:p>
@@ -488,7 +488,7 @@
         <w:t>Automation_Probability_2030</w:t>
       </w:r>
       <w:r>
-        <w:t xml:space="preserve"> a partir de 15 predictores derivados del perfil laboral: </w:t>
+        <w:t xml:space="preserve"> a partir de los predictores derivados del perfil laboral disponibles: </w:t>
       </w:r>
       <w:r>
         <w:rPr>
@@ -538,7 +538,7 @@
         <w:t>Tech_Growth_Factor</w:t>
       </w:r>
       <w:r>
-        <w:t xml:space="preserve"> y los diez puntajes de habilidades </w:t>
+        <w:t xml:space="preserve">, los diez puntajes de habilidades </w:t>
       </w:r>
       <w:r>
         <w:rPr>
@@ -558,7 +558,27 @@
         <w:t>Skill_10</w:t>
       </w:r>
       <w:r>
-        <w:t>. Estos predictores representan características socioeconómicas, de trayectoria laboral y de perfil de competencias de cada cargo. La relación entre estas variables y la variable continua de salida permite aplicar modelos supervisados de regresión: regresión lineal, árboles de decisión y redes neuronales artificiales.</w:t>
+        <w:t>, y el cargo (</w:t>
+      </w:r>
+      <w:r>
+        <w:rPr>
+          <w:rFonts w:ascii="Consolas" w:hAnsi="Consolas"/>
+          <w:sz w:val="20"/>
+        </w:rPr>
+        <w:t>Job_Title</w:t>
+      </w:r>
+      <w:r>
+        <w:t xml:space="preserve">). Como se detalla en la sección III, un análisis exploratorio realizado durante esta fase mostró que </w:t>
+      </w:r>
+      <w:r>
+        <w:rPr>
+          <w:rFonts w:ascii="Consolas" w:hAnsi="Consolas"/>
+          <w:sz w:val="20"/>
+        </w:rPr>
+        <w:t>Job_Title</w:t>
+      </w:r>
+      <w:r>
+        <w:t xml:space="preserve"> concentra, por sí solo, cerca del 86% de la varianza de la variable objetivo, lo que motivó incorporarlo —mediante codificación one-hot— al conjunto final de predictores, revirtiendo una decisión de preprocesamiento inicial que lo excluía. Estos predictores representan características socioeconómicas, de trayectoria laboral y de perfil de competencias de cada cargo. La relación entre estas variables y la variable continua de salida permite aplicar modelos supervisados de regresión: regresión lineal, árboles de decisión y redes neuronales artificiales.</w:t>
       </w:r>
     </w:p>
     <w:p>
@@ -578,7 +598,7 @@
           <w:noProof/>
         </w:rPr>
         <w:drawing>
-          <wp:inline distT="0" distB="0" distL="0" distR="0" wp14:anchorId="79E36CD5" wp14:editId="24D32F60">
+          <wp:inline distT="0" distB="0" distL="0" distR="0" wp14:anchorId="24A61032" wp14:editId="11C806D0">
             <wp:extent cx="5760720" cy="1384359"/>
             <wp:effectExtent l="0" t="0" r="0" b="0"/>
             <wp:docPr id="2" name="Picture 2"/>
@@ -618,26 +638,76 @@
       <w:pPr>
         <w:spacing w:after="240"/>
         <w:jc w:val="center"/>
-      </w:pPr>
-      <w:r>
         <w:rPr>
           <w:i/>
           <w:color w:val="52514E"/>
           <w:sz w:val="19"/>
         </w:rPr>
-        <w:t>Figura 1. Flujo de trabajo aplicado en la Fase 2 del proyecto.</w:t>
+      </w:pPr>
+      <w:r>
+        <w:rPr>
+          <w:i/>
+          <w:color w:val="52514E"/>
+          <w:sz w:val="19"/>
+        </w:rPr>
+        <w:t xml:space="preserve">Figura 1. Flujo de trabajo aplicado en la Fase 2 del </w:t>
+      </w:r>
+      <w:proofErr w:type="spellStart"/>
+      <w:r>
+        <w:rPr>
+          <w:i/>
+          <w:color w:val="52514E"/>
+          <w:sz w:val="19"/>
+        </w:rPr>
+        <w:t>proyecto</w:t>
+      </w:r>
+      <w:proofErr w:type="spellEnd"/>
+      <w:r>
+        <w:rPr>
+          <w:i/>
+          <w:color w:val="52514E"/>
+          <w:sz w:val="19"/>
+        </w:rPr>
+        <w:t>.</w:t>
       </w:r>
     </w:p>
     <w:p>
       <w:pPr>
+        <w:spacing w:after="240"/>
+        <w:jc w:val="center"/>
+      </w:pPr>
+    </w:p>
+    <w:p>
+      <w:pPr>
         <w:spacing w:before="360" w:after="160"/>
-      </w:pPr>
-      <w:r>
         <w:rPr>
           <w:b/>
           <w:color w:val="0B1C2C"/>
           <w:sz w:val="32"/>
         </w:rPr>
+      </w:pPr>
+    </w:p>
+    <w:p>
+      <w:pPr>
+        <w:spacing w:before="360" w:after="160"/>
+        <w:rPr>
+          <w:b/>
+          <w:color w:val="0B1C2C"/>
+          <w:sz w:val="32"/>
+        </w:rPr>
+      </w:pPr>
+    </w:p>
+    <w:p>
+      <w:pPr>
+        <w:spacing w:before="360" w:after="160"/>
+      </w:pPr>
+      <w:r>
+        <w:rPr>
+          <w:b/>
+          <w:color w:val="0B1C2C"/>
+          <w:sz w:val="32"/>
+        </w:rPr>
+        <w:lastRenderedPageBreak/>
         <w:t>III. Descripción del conjunto de datos y preprocesamiento</w:t>
       </w:r>
     </w:p>
@@ -799,7 +869,6 @@
                 <w:color w:val="FFFFFF"/>
                 <w:sz w:val="19"/>
               </w:rPr>
-              <w:lastRenderedPageBreak/>
               <w:t>Variable</w:t>
             </w:r>
           </w:p>
@@ -1171,7 +1240,7 @@
               <w:rPr>
                 <w:sz w:val="19"/>
               </w:rPr>
-              <w:t>Excluida en esta fase</w:t>
+              <w:t>Predictora (codificada one-hot)</w:t>
             </w:r>
           </w:p>
         </w:tc>
@@ -1184,7 +1253,7 @@
               <w:rPr>
                 <w:sz w:val="19"/>
               </w:rPr>
-              <w:t>Cargo (20 categorías nominales); se excluye del modelamiento (ver 3.4).</w:t>
+              <w:t>Cargo (20 categorías nominales); incorporada tras la exploración de la sección 3.3 (ver 3.4).</w:t>
             </w:r>
           </w:p>
         </w:tc>
@@ -2004,7 +2073,8 @@
           <w:color w:val="0B1C2C"/>
           <w:sz w:val="26"/>
         </w:rPr>
-        <w:t>3.3 Selección y codificación de variables</w:t>
+        <w:lastRenderedPageBreak/>
+        <w:t>3.3 Exploración adicional: relación entre Job_Title y la variable objetivo</w:t>
       </w:r>
     </w:p>
     <w:p>
@@ -2012,39 +2082,124 @@
         <w:spacing w:after="160"/>
       </w:pPr>
       <w:r>
-        <w:t>Para construir la matriz de predictores se adoptan tres decisiones técnicas, justificadas a continuación:</w:t>
+        <w:t xml:space="preserve">En una primera iteración de esta fase, </w:t>
+      </w:r>
+      <w:r>
+        <w:rPr>
+          <w:rFonts w:ascii="Consolas" w:hAnsi="Consolas"/>
+          <w:sz w:val="20"/>
+        </w:rPr>
+        <w:t>Job_Title</w:t>
+      </w:r>
+      <w:r>
+        <w:t xml:space="preserve"> se excluyó del conjunto de predictores por ser nominal de 20 categorías (ver justificación original en la sección 3.4). Sin embargo, dado que los 15 predictores numéricos/ordinales restantes mostraron una relación muy débil con </w:t>
+      </w:r>
+      <w:r>
+        <w:rPr>
+          <w:rFonts w:ascii="Consolas" w:hAnsi="Consolas"/>
+          <w:sz w:val="20"/>
+        </w:rPr>
+        <w:t>Automation_Probability_2030</w:t>
+      </w:r>
+      <w:r>
+        <w:t xml:space="preserve"> (Fase 1), se exploró si el propio </w:t>
+      </w:r>
+      <w:r>
+        <w:rPr>
+          <w:rFonts w:ascii="Consolas" w:hAnsi="Consolas"/>
+          <w:sz w:val="20"/>
+        </w:rPr>
+        <w:t>Job_Title</w:t>
+      </w:r>
+      <w:r>
+        <w:t xml:space="preserve"> concentraba señal predictiva relevante, calculando el promedio de la variable objetivo por cargo.</w:t>
       </w:r>
     </w:p>
     <w:p>
       <w:pPr>
-        <w:pStyle w:val="ListBullet"/>
-        <w:spacing w:after="80"/>
-      </w:pPr>
+        <w:jc w:val="center"/>
+      </w:pPr>
+      <w:r>
+        <w:rPr>
+          <w:noProof/>
+        </w:rPr>
+        <w:drawing>
+          <wp:inline distT="0" distB="0" distL="0" distR="0" wp14:anchorId="41BA1954" wp14:editId="1B6A7519">
+            <wp:extent cx="4846320" cy="4225206"/>
+            <wp:effectExtent l="0" t="0" r="0" b="0"/>
+            <wp:docPr id="3" name="Picture 3"/>
+            <wp:cNvGraphicFramePr>
+              <a:graphicFrameLocks xmlns:a="http://schemas.openxmlformats.org/drawingml/2006/main" noChangeAspect="1"/>
+            </wp:cNvGraphicFramePr>
+            <a:graphic xmlns:a="http://schemas.openxmlformats.org/drawingml/2006/main">
+              <a:graphicData uri="http://schemas.openxmlformats.org/drawingml/2006/picture">
+                <pic:pic xmlns:pic="http://schemas.openxmlformats.org/drawingml/2006/picture">
+                  <pic:nvPicPr>
+                    <pic:cNvPr id="0" name="f2_job_title_means.png"/>
+                    <pic:cNvPicPr/>
+                  </pic:nvPicPr>
+                  <pic:blipFill>
+                    <a:blip r:embed="rId8"/>
+                    <a:stretch>
+                      <a:fillRect/>
+                    </a:stretch>
+                  </pic:blipFill>
+                  <pic:spPr>
+                    <a:xfrm>
+                      <a:off x="0" y="0"/>
+                      <a:ext cx="4846320" cy="4225206"/>
+                    </a:xfrm>
+                    <a:prstGeom prst="rect">
+                      <a:avLst/>
+                    </a:prstGeom>
+                  </pic:spPr>
+                </pic:pic>
+              </a:graphicData>
+            </a:graphic>
+          </wp:inline>
+        </w:drawing>
+      </w:r>
+    </w:p>
+    <w:p>
+      <w:pPr>
+        <w:spacing w:after="240"/>
+        <w:jc w:val="center"/>
+      </w:pPr>
+      <w:r>
+        <w:rPr>
+          <w:i/>
+          <w:color w:val="52514E"/>
+          <w:sz w:val="19"/>
+        </w:rPr>
+        <w:t>Figura 2. Probabilidad de automatización promedio por cargo (Job_Title).</w:t>
+      </w:r>
+    </w:p>
+    <w:p>
+      <w:pPr>
+        <w:spacing w:after="160"/>
+      </w:pPr>
+      <w:r>
+        <w:t xml:space="preserve">El promedio de </w:t>
+      </w:r>
       <w:r>
         <w:rPr>
           <w:rFonts w:ascii="Consolas" w:hAnsi="Consolas"/>
           <w:sz w:val="20"/>
         </w:rPr>
-        <w:t>Education_Level</w:t>
-      </w:r>
-      <w:r>
-        <w:t xml:space="preserve"> — </w:t>
+        <w:t>Automation_Probability_2030</w:t>
+      </w:r>
+      <w:r>
+        <w:t xml:space="preserve"> por cargo se agrupa en </w:t>
       </w:r>
       <w:r>
         <w:rPr>
           <w:b/>
         </w:rPr>
-        <w:t>codificación ordinal:</w:t>
-      </w:r>
-      <w:r>
-        <w:t xml:space="preserve"> se mapea High School=1, Bachelor's=2, Master's=3, PhD=4, replicando el criterio ya utilizado en la Fase 1, dado que es una variable categórica con orden natural.</w:t>
-      </w:r>
-    </w:p>
-    <w:p>
-      <w:pPr>
-        <w:pStyle w:val="ListBullet"/>
-        <w:spacing w:after="80"/>
-      </w:pPr>
+        <w:t>tres niveles muy nítidos</w:t>
+      </w:r>
+      <w:r>
+        <w:t xml:space="preserve">: un grupo de riesgo bajo (≈0,17-0,18: AI Engineer, Research Scientist, Nurse, Teacher, Doctor), un grupo de riesgo medio (≈0,48-0,53: Financial Analyst, Mechanic, Lawyer, HR Specialist, UX Researcher, Marketing Manager, Chef, Data Scientist, Software Engineer, Graphic Designer) y un grupo de riesgo alto (≈0,82-0,83: Truck Driver, Customer Support, Construction Worker, Security Guard, Retail Worker). Calculando la proporción de varianza explicada solo por el promedio de cada </w:t>
+      </w:r>
       <w:r>
         <w:rPr>
           <w:rFonts w:ascii="Consolas" w:hAnsi="Consolas"/>
@@ -2053,129 +2208,35 @@
         <w:t>Job_Title</w:t>
       </w:r>
       <w:r>
-        <w:t xml:space="preserve"> — </w:t>
+        <w:t xml:space="preserve"> (equivalente a un R² de agrupación), se obtiene </w:t>
       </w:r>
       <w:r>
         <w:rPr>
           <w:b/>
         </w:rPr>
-        <w:t>variable excluida:</w:t>
-      </w:r>
-      <w:r>
-        <w:t xml:space="preserve"> al ser una variable nominal de 20 categorías, incorporarla exigiría codificación one-hot (19 columnas dummy adicionales). Se prioriza un conjunto de predictores acotado e interpretable en esta primera fase de modelamiento, dado además que la Fase 1 ya había mostrado correlaciones lineales muy débiles entre las variables de perfil disponibles y la variable objetivo. Queda como línea de mejora para fases posteriores.</w:t>
-      </w:r>
-    </w:p>
-    <w:p>
-      <w:pPr>
-        <w:pStyle w:val="ListBullet"/>
-        <w:spacing w:after="80"/>
-      </w:pPr>
+        <w:t>≈0,857</w:t>
+      </w:r>
+      <w:r>
+        <w:t xml:space="preserve">: el cargo, por sí solo, explica cerca del 86% de la varianza de la variable objetivo, muy por encima de lo obtenido con los 15 predictores numéricos/ordinales analizados en la Fase 1 (correlación de Pearson cercana a cero). Esta evidencia cuantitativa </w:t>
+      </w:r>
+      <w:r>
+        <w:rPr>
+          <w:b/>
+        </w:rPr>
+        <w:t>revierte la decisión de preprocesamiento inicial</w:t>
+      </w:r>
+      <w:r>
+        <w:t xml:space="preserve">: en la sección 3.4, </w:t>
+      </w:r>
       <w:r>
         <w:rPr>
           <w:rFonts w:ascii="Consolas" w:hAnsi="Consolas"/>
           <w:sz w:val="20"/>
         </w:rPr>
-        <w:lastRenderedPageBreak/>
-        <w:t>Risk_Category</w:t>
-      </w:r>
-      <w:r>
-        <w:t xml:space="preserve"> — </w:t>
-      </w:r>
-      <w:r>
-        <w:rPr>
-          <w:b/>
-        </w:rPr>
-        <w:t>variable excluida:</w:t>
-      </w:r>
-      <w:r>
-        <w:t xml:space="preserve"> esta variable se deriva directamente de Automation_Probability_2030 mediante un corte por umbrales (Low: 0.05–0.30, Medium: 0.31–0.70, High: 0.71–0.95). Incluirla como predictora constituiría una fuga de información (data leakage), ya que el modelo aprendería a partir de una versión discretizada de la propia variable objetivo.</w:t>
-      </w:r>
-    </w:p>
-    <w:p>
-      <w:pPr>
-        <w:spacing w:after="160"/>
-      </w:pPr>
-      <w:r>
-        <w:t xml:space="preserve">El conjunto final de predictores queda compuesto por </w:t>
-      </w:r>
-      <w:r>
-        <w:rPr>
-          <w:b/>
-        </w:rPr>
-        <w:t>15 variables</w:t>
-      </w:r>
-      <w:r>
-        <w:t xml:space="preserve">: </w:t>
-      </w:r>
-      <w:r>
-        <w:rPr>
-          <w:rFonts w:ascii="Consolas" w:hAnsi="Consolas"/>
-          <w:sz w:val="20"/>
-        </w:rPr>
-        <w:t>Average_Salary</w:t>
-      </w:r>
-      <w:r>
-        <w:t xml:space="preserve">, </w:t>
-      </w:r>
-      <w:r>
-        <w:rPr>
-          <w:rFonts w:ascii="Consolas" w:hAnsi="Consolas"/>
-          <w:sz w:val="20"/>
-        </w:rPr>
-        <w:t>Years_Experience</w:t>
-      </w:r>
-      <w:r>
-        <w:t xml:space="preserve">, </w:t>
-      </w:r>
-      <w:r>
-        <w:rPr>
-          <w:rFonts w:ascii="Consolas" w:hAnsi="Consolas"/>
-          <w:sz w:val="20"/>
-        </w:rPr>
-        <w:t>Education_Level</w:t>
-      </w:r>
-      <w:r>
-        <w:t xml:space="preserve"> (codificada), </w:t>
-      </w:r>
-      <w:r>
-        <w:rPr>
-          <w:rFonts w:ascii="Consolas" w:hAnsi="Consolas"/>
-          <w:sz w:val="20"/>
-        </w:rPr>
-        <w:t>AI_Exposure_Index</w:t>
-      </w:r>
-      <w:r>
-        <w:t xml:space="preserve">, </w:t>
-      </w:r>
-      <w:r>
-        <w:rPr>
-          <w:rFonts w:ascii="Consolas" w:hAnsi="Consolas"/>
-          <w:sz w:val="20"/>
-        </w:rPr>
-        <w:t>Tech_Growth_Factor</w:t>
-      </w:r>
-      <w:r>
-        <w:t xml:space="preserve"> y </w:t>
-      </w:r>
-      <w:r>
-        <w:rPr>
-          <w:rFonts w:ascii="Consolas" w:hAnsi="Consolas"/>
-          <w:sz w:val="20"/>
-        </w:rPr>
-        <w:t>Skill_1</w:t>
-      </w:r>
-      <w:r>
-        <w:t>–</w:t>
-      </w:r>
-      <w:r>
-        <w:rPr>
-          <w:rFonts w:ascii="Consolas" w:hAnsi="Consolas"/>
-          <w:sz w:val="20"/>
-        </w:rPr>
-        <w:t>Skill_10</w:t>
-      </w:r>
-      <w:r>
-        <w:t>.</w:t>
+        <w:t>Job_Title</w:t>
+      </w:r>
+      <w:r>
+        <w:t xml:space="preserve"> se incorpora como predictor.</w:t>
       </w:r>
     </w:p>
     <w:p>
@@ -2188,7 +2249,7 @@
           <w:color w:val="0B1C2C"/>
           <w:sz w:val="26"/>
         </w:rPr>
-        <w:t>3.4 Partición entrenamiento/prueba y escalamiento</w:t>
+        <w:t>3.4 Selección y codificación de variables</w:t>
       </w:r>
     </w:p>
     <w:p>
@@ -2196,34 +2257,65 @@
         <w:spacing w:after="160"/>
       </w:pPr>
       <w:r>
-        <w:t xml:space="preserve">El código separa las características predictoras en </w:t>
-      </w:r>
+        <w:t>A la luz de la exploración anterior, se adoptan las siguientes decisiones técnicas para construir la matriz de predictores:</w:t>
+      </w:r>
+    </w:p>
+    <w:p>
+      <w:pPr>
+        <w:pStyle w:val="ListBullet"/>
+        <w:spacing w:after="80"/>
+      </w:pPr>
       <w:r>
         <w:rPr>
           <w:rFonts w:ascii="Consolas" w:hAnsi="Consolas"/>
           <w:sz w:val="20"/>
         </w:rPr>
-        <w:t>X</w:t>
-      </w:r>
-      <w:r>
-        <w:t xml:space="preserve"> (3.000 × 15) y la variable objetivo en </w:t>
-      </w:r>
+        <w:t>Education_Level</w:t>
+      </w:r>
+      <w:r>
+        <w:t xml:space="preserve"> — </w:t>
+      </w:r>
+      <w:r>
+        <w:rPr>
+          <w:b/>
+        </w:rPr>
+        <w:t>codificación ordinal:</w:t>
+      </w:r>
+      <w:r>
+        <w:t xml:space="preserve"> se mapea High School=1, Bachelor's=2, Master's=3, PhD=4, replicando el criterio ya utilizado en la Fase 1, dado que es una variable categórica con orden natural.</w:t>
+      </w:r>
+    </w:p>
+    <w:p>
+      <w:pPr>
+        <w:pStyle w:val="ListBullet"/>
+        <w:spacing w:after="80"/>
+      </w:pPr>
       <w:r>
         <w:rPr>
           <w:rFonts w:ascii="Consolas" w:hAnsi="Consolas"/>
           <w:sz w:val="20"/>
         </w:rPr>
-        <w:t>y</w:t>
-      </w:r>
-      <w:r>
-        <w:t xml:space="preserve"> (3.000). Luego aplica una partición de 80% para entrenamiento y 20% para prueba mediante </w:t>
+        <w:lastRenderedPageBreak/>
+        <w:t>Job_Title</w:t>
+      </w:r>
+      <w:r>
+        <w:t xml:space="preserve"> — </w:t>
+      </w:r>
+      <w:r>
+        <w:rPr>
+          <w:b/>
+        </w:rPr>
+        <w:t>incorporada mediante codificación one-hot</w:t>
+      </w:r>
+      <w:r>
+        <w:t xml:space="preserve"> (</w:t>
       </w:r>
       <w:r>
         <w:rPr>
           <w:rFonts w:ascii="Consolas" w:hAnsi="Consolas"/>
           <w:sz w:val="20"/>
         </w:rPr>
-        <w:t>train_test_split</w:t>
+        <w:t>pd.get_dummies</w:t>
       </w:r>
       <w:r>
         <w:t xml:space="preserve">, con </w:t>
@@ -2233,34 +2325,226 @@
           <w:rFonts w:ascii="Consolas" w:hAnsi="Consolas"/>
           <w:sz w:val="20"/>
         </w:rPr>
-        <w:t>random_state=42</w:t>
-      </w:r>
-      <w:r>
-        <w:t xml:space="preserve"> para asegurar la reproducibilidad de los tres modelos. Posteriormente, las variables predictoras se estandarizan con </w:t>
+        <w:t>drop_first=True</w:t>
+      </w:r>
+      <w:r>
+        <w:t xml:space="preserve"> para evitar la trampa de la variable dummy), generando 19 columnas binarias sobre las 20 categorías del cargo. La sección 3.3 mostró que esta variable, por sí sola, explica ~86% de la varianza de </w:t>
       </w:r>
       <w:r>
         <w:rPr>
           <w:rFonts w:ascii="Consolas" w:hAnsi="Consolas"/>
           <w:sz w:val="20"/>
         </w:rPr>
-        <w:t>StandardScaler</w:t>
-      </w:r>
-      <w:r>
-        <w:t xml:space="preserve">, ajustado únicamente sobre </w:t>
-      </w:r>
+        <w:t>Automation_Probability_2030</w:t>
+      </w:r>
+      <w:r>
+        <w:t>; excluirla —como se hizo en una primera iteración de esta fase, priorizando parsimonia sobre poder predictivo— descartaba la señal más relevante disponible en el dataset.</w:t>
+      </w:r>
+    </w:p>
+    <w:p>
+      <w:pPr>
+        <w:pStyle w:val="ListBullet"/>
+        <w:spacing w:after="80"/>
+      </w:pPr>
       <w:r>
         <w:rPr>
           <w:rFonts w:ascii="Consolas" w:hAnsi="Consolas"/>
           <w:sz w:val="20"/>
         </w:rPr>
-        <w:t>X_train</w:t>
-      </w:r>
-      <w:r>
-        <w:t xml:space="preserve"> para evitar filtrar información del conjunto de prueba. Este paso es especialmente relevante para la regresión lineal y, sobre todo, para la red neuronal, dado que ambos son sensibles a la escala de las variables (Ruete, 2026a; Ruete, 2026c; scikit-learn Developers, 2026b).</w:t>
+        <w:t>Risk_Category</w:t>
+      </w:r>
+      <w:r>
+        <w:t xml:space="preserve"> — </w:t>
+      </w:r>
+      <w:r>
+        <w:rPr>
+          <w:b/>
+        </w:rPr>
+        <w:t>variable excluida:</w:t>
+      </w:r>
+      <w:r>
+        <w:t xml:space="preserve"> esta variable se deriva directamente de Automation_Probability_2030 mediante un corte por umbrales (Low: 0.05–0.30, Medium: 0.31–0.70, High: 0.71–0.95). Incluirla como predictora constituiría una fuga de información (data leakage), ya que el modelo aprendería a partir de una versión discretizada de la propia variable objetivo.</w:t>
       </w:r>
     </w:p>
     <w:p>
       <w:pPr>
+        <w:spacing w:after="160"/>
+      </w:pPr>
+      <w:r>
+        <w:t xml:space="preserve">El conjunto final de predictores queda compuesto por </w:t>
+      </w:r>
+      <w:r>
+        <w:rPr>
+          <w:b/>
+        </w:rPr>
+        <w:t>34 variables</w:t>
+      </w:r>
+      <w:r>
+        <w:t>: las 15 numéricas/ordinales ya descritas (</w:t>
+      </w:r>
+      <w:r>
+        <w:rPr>
+          <w:rFonts w:ascii="Consolas" w:hAnsi="Consolas"/>
+          <w:sz w:val="20"/>
+        </w:rPr>
+        <w:t>Average_Salary</w:t>
+      </w:r>
+      <w:r>
+        <w:t xml:space="preserve">, </w:t>
+      </w:r>
+      <w:r>
+        <w:rPr>
+          <w:rFonts w:ascii="Consolas" w:hAnsi="Consolas"/>
+          <w:sz w:val="20"/>
+        </w:rPr>
+        <w:t>Years_Experience</w:t>
+      </w:r>
+      <w:r>
+        <w:t xml:space="preserve">, </w:t>
+      </w:r>
+      <w:r>
+        <w:rPr>
+          <w:rFonts w:ascii="Consolas" w:hAnsi="Consolas"/>
+          <w:sz w:val="20"/>
+        </w:rPr>
+        <w:t>Education_Level</w:t>
+      </w:r>
+      <w:r>
+        <w:t xml:space="preserve"> codificada, </w:t>
+      </w:r>
+      <w:r>
+        <w:rPr>
+          <w:rFonts w:ascii="Consolas" w:hAnsi="Consolas"/>
+          <w:sz w:val="20"/>
+        </w:rPr>
+        <w:t>AI_Exposure_Index</w:t>
+      </w:r>
+      <w:r>
+        <w:t xml:space="preserve">, </w:t>
+      </w:r>
+      <w:r>
+        <w:rPr>
+          <w:rFonts w:ascii="Consolas" w:hAnsi="Consolas"/>
+          <w:sz w:val="20"/>
+        </w:rPr>
+        <w:t>Tech_Growth_Factor</w:t>
+      </w:r>
+      <w:r>
+        <w:t xml:space="preserve">, </w:t>
+      </w:r>
+      <w:r>
+        <w:rPr>
+          <w:rFonts w:ascii="Consolas" w:hAnsi="Consolas"/>
+          <w:sz w:val="20"/>
+        </w:rPr>
+        <w:t>Skill_1</w:t>
+      </w:r>
+      <w:r>
+        <w:t>–</w:t>
+      </w:r>
+      <w:r>
+        <w:rPr>
+          <w:rFonts w:ascii="Consolas" w:hAnsi="Consolas"/>
+          <w:sz w:val="20"/>
+        </w:rPr>
+        <w:t>Skill_10</w:t>
+      </w:r>
+      <w:r>
+        <w:t xml:space="preserve">) más las </w:t>
+      </w:r>
+      <w:r>
+        <w:rPr>
+          <w:b/>
+        </w:rPr>
+        <w:t>19 columnas dummy de `Job_Title`</w:t>
+      </w:r>
+      <w:r>
+        <w:t xml:space="preserve"> (categoría de referencia: "AI Engineer").</w:t>
+      </w:r>
+    </w:p>
+    <w:p>
+      <w:pPr>
+        <w:spacing w:before="200" w:after="120"/>
+      </w:pPr>
+      <w:r>
+        <w:rPr>
+          <w:b/>
+          <w:color w:val="0B1C2C"/>
+          <w:sz w:val="26"/>
+        </w:rPr>
+        <w:t>3.5 Partición entrenamiento/prueba y escalamiento</w:t>
+      </w:r>
+    </w:p>
+    <w:p>
+      <w:pPr>
+        <w:spacing w:after="160"/>
+      </w:pPr>
+      <w:r>
+        <w:t xml:space="preserve">El código separa las características predictoras en </w:t>
+      </w:r>
+      <w:r>
+        <w:rPr>
+          <w:rFonts w:ascii="Consolas" w:hAnsi="Consolas"/>
+          <w:sz w:val="20"/>
+        </w:rPr>
+        <w:t>X</w:t>
+      </w:r>
+      <w:r>
+        <w:t xml:space="preserve"> (3.000 × 34) y la variable objetivo en </w:t>
+      </w:r>
+      <w:r>
+        <w:rPr>
+          <w:rFonts w:ascii="Consolas" w:hAnsi="Consolas"/>
+          <w:sz w:val="20"/>
+        </w:rPr>
+        <w:t>y</w:t>
+      </w:r>
+      <w:r>
+        <w:t xml:space="preserve"> (3.000). Luego aplica una partición de 80% para entrenamiento y 20% para prueba mediante </w:t>
+      </w:r>
+      <w:r>
+        <w:rPr>
+          <w:rFonts w:ascii="Consolas" w:hAnsi="Consolas"/>
+          <w:sz w:val="20"/>
+        </w:rPr>
+        <w:t>train_test_split</w:t>
+      </w:r>
+      <w:r>
+        <w:t xml:space="preserve">, con </w:t>
+      </w:r>
+      <w:r>
+        <w:rPr>
+          <w:rFonts w:ascii="Consolas" w:hAnsi="Consolas"/>
+          <w:sz w:val="20"/>
+        </w:rPr>
+        <w:t>random_state=42</w:t>
+      </w:r>
+      <w:r>
+        <w:t xml:space="preserve"> para asegurar la reproducibilidad de los tres modelos. Posteriormente, las variables predictoras se estandarizan con </w:t>
+      </w:r>
+      <w:r>
+        <w:rPr>
+          <w:rFonts w:ascii="Consolas" w:hAnsi="Consolas"/>
+          <w:sz w:val="20"/>
+        </w:rPr>
+        <w:t>StandardScaler</w:t>
+      </w:r>
+      <w:r>
+        <w:t xml:space="preserve">, ajustado únicamente sobre </w:t>
+      </w:r>
+      <w:r>
+        <w:rPr>
+          <w:rFonts w:ascii="Consolas" w:hAnsi="Consolas"/>
+          <w:sz w:val="20"/>
+        </w:rPr>
+        <w:t>X_train</w:t>
+      </w:r>
+      <w:r>
+        <w:t xml:space="preserve"> para evitar filtrar información del conjunto de prueba. Este paso es especialmente relevante para la regresión lineal y, sobre todo, para la red neuronal, dado que ambos son sensibles a la escala de las variables (Ruete, 2026a; Ruete, 2026c; scikit-learn Developers, 2026b).</w:t>
+      </w:r>
+    </w:p>
+    <w:p>
+      <w:pPr>
         <w:jc w:val="center"/>
       </w:pPr>
       <w:r>
@@ -2268,10 +2552,10 @@
           <w:noProof/>
         </w:rPr>
         <w:drawing>
-          <wp:inline distT="0" distB="0" distL="0" distR="0" wp14:anchorId="54CD436D" wp14:editId="61A0865C">
+          <wp:inline distT="0" distB="0" distL="0" distR="0" wp14:anchorId="5E1B01CB" wp14:editId="4D20AE0C">
             <wp:extent cx="5760720" cy="1608471"/>
             <wp:effectExtent l="0" t="0" r="0" b="0"/>
-            <wp:docPr id="3" name="Picture 3"/>
+            <wp:docPr id="4" name="Picture 4"/>
             <wp:cNvGraphicFramePr>
               <a:graphicFrameLocks xmlns:a="http://schemas.openxmlformats.org/drawingml/2006/main" noChangeAspect="1"/>
             </wp:cNvGraphicFramePr>
@@ -2283,7 +2567,7 @@
                     <pic:cNvPicPr/>
                   </pic:nvPicPr>
                   <pic:blipFill>
-                    <a:blip r:embed="rId8"/>
+                    <a:blip r:embed="rId9"/>
                     <a:stretch>
                       <a:fillRect/>
                     </a:stretch>
@@ -2315,7 +2599,7 @@
           <w:color w:val="52514E"/>
           <w:sz w:val="19"/>
         </w:rPr>
-        <w:t>Figura 2. Partición de observaciones para entrenamiento y prueba.</w:t>
+        <w:t>Figura 3. Partición de observaciones para entrenamiento y prueba.</w:t>
       </w:r>
     </w:p>
     <w:p>
@@ -2771,10 +3055,17 @@
         <w:spacing w:after="160"/>
       </w:pPr>
       <w:r>
-        <w:t>La regresión lineal se utiliza como modelo base porque ofrece una primera aproximación interpretable de la relación entre los predictores y una variable continua. En términos conceptuales, busca una combinación lineal de variables que minimice la suma de errores cuadrados entre los valores reales y los predichos. El apunte de regresión lineal la presenta como punto de partida para comprender modelos de respuesta continua, coeficientes y evaluación del ajuste (Ruete, 2026a). Dado que ID2.1 admite regresión l</w:t>
-      </w:r>
-      <w:r>
-        <w:t xml:space="preserve">ineal simple, polinomial o multivariable, y que se dispone de 15 predictores, se implementa una </w:t>
+        <w:t xml:space="preserve">La regresión lineal se utiliza como modelo base porque ofrece una primera aproximación interpretable de la relación entre los predictores y una variable continua. En términos conceptuales, busca una combinación lineal de variables que minimice la suma de errores cuadrados entre los valores reales y los predichos. El apunte de regresión lineal la presenta como punto de partida para comprender modelos de respuesta continua, coeficientes y evaluación del ajuste (Ruete, 2026a). Dado que ID2.1 admite regresión lineal simple, polinomial o multivariable, y que se dispone de 34 predictores (15 numéricos/ordinales + 19 dummies de </w:t>
+      </w:r>
+      <w:r>
+        <w:rPr>
+          <w:rFonts w:ascii="Consolas" w:hAnsi="Consolas"/>
+          <w:sz w:val="20"/>
+        </w:rPr>
+        <w:t>Job_Title</w:t>
+      </w:r>
+      <w:r>
+        <w:t xml:space="preserve">), se implementa una </w:t>
       </w:r>
       <w:r>
         <w:rPr>
@@ -2834,7 +3125,7 @@
         <w:t>y_train</w:t>
       </w:r>
       <w:r>
-        <w:t xml:space="preserve">, usando las 15 variables predictoras descritas en la sección 3.3. Luego se generan predicciones sobre </w:t>
+        <w:t xml:space="preserve">, usando las 34 variables predictoras descritas en la sección 3.4. Luego se generan predicciones sobre </w:t>
       </w:r>
       <w:r>
         <w:rPr>
@@ -2935,7 +3226,7 @@
               <w:rPr>
                 <w:sz w:val="19"/>
               </w:rPr>
-              <w:t>[0.5013, 0.5425, 0.5024, 0.4797, 0.5075]</w:t>
+              <w:t>[0.5035, 0.8432, 0.4790, 0.4742, 0.5027]</w:t>
             </w:r>
           </w:p>
         </w:tc>
@@ -2966,7 +3257,7 @@
               <w:rPr>
                 <w:sz w:val="19"/>
               </w:rPr>
-              <w:t>0.0643</w:t>
+              <w:t>0.0087</w:t>
             </w:r>
           </w:p>
         </w:tc>
@@ -2997,7 +3288,7 @@
               <w:rPr>
                 <w:sz w:val="19"/>
               </w:rPr>
-              <w:t>0.2535</w:t>
+              <w:t>0.0933</w:t>
             </w:r>
           </w:p>
         </w:tc>
@@ -3028,7 +3319,7 @@
               <w:rPr>
                 <w:sz w:val="19"/>
               </w:rPr>
-              <w:t>-0.0068</w:t>
+              <w:t>0.8638</w:t>
             </w:r>
           </w:p>
         </w:tc>
@@ -3057,26 +3348,26 @@
         <w:spacing w:after="160"/>
       </w:pPr>
       <w:r>
-        <w:t xml:space="preserve">El modelo lineal obtiene un </w:t>
-      </w:r>
-      <w:r>
-        <w:rPr>
-          <w:b/>
-        </w:rPr>
-        <w:t>R² de -0,0068</w:t>
-      </w:r>
-      <w:r>
-        <w:t xml:space="preserve"> sobre el conjunto de prueba, es decir, predice de forma prácticamente idéntica a usar el promedio de </w:t>
+        <w:t xml:space="preserve">A diferencia de la primera iteración de esta fase (sin </w:t>
       </w:r>
       <w:r>
         <w:rPr>
           <w:rFonts w:ascii="Consolas" w:hAnsi="Consolas"/>
           <w:sz w:val="20"/>
         </w:rPr>
-        <w:t>Automation_Probability_2030</w:t>
-      </w:r>
-      <w:r>
-        <w:t xml:space="preserve"> observado en entrenamiento, sin capacidad explicativa neta. Su RMSE de 0,2535 indica un error típico de ±0,25 en la probabilidad de automatización (sobre una escala 0-1), lo que en términos prácticos equivale a un margen de error demasiado amplio para uso operativo. Este resultado es consistente con el hallazgo de la Fase 1: la matriz de correlación de Pearson ya había mostrado relaciones lineales muy débiles entre las variables de perfil laboral disponibles y </w:t>
+        <w:t>Job_Title</w:t>
+      </w:r>
+      <w:r>
+        <w:t xml:space="preserve">, R²≈-0,01), el modelo lineal multivariable con las 34 variables alcanza un </w:t>
+      </w:r>
+      <w:r>
+        <w:rPr>
+          <w:b/>
+        </w:rPr>
+        <w:t>R² ≈ 0,864</w:t>
+      </w:r>
+      <w:r>
+        <w:t xml:space="preserve"> sobre el conjunto de prueba: explica cerca del 86% de la varianza de </w:t>
       </w:r>
       <w:r>
         <w:rPr>
@@ -3086,37 +3377,126 @@
         <w:t>Automation_Probability_2030</w:t>
       </w:r>
       <w:r>
-        <w:t>. Los coeficientes con mayor magnitud absoluta (</w:t>
+        <w:t xml:space="preserve">, con un RMSE ≈ 0,093 (error típico de ±9,3 puntos porcentuales de probabilidad, frente a ±25 puntos porcentuales del modelo sin </w:t>
       </w:r>
       <w:r>
         <w:rPr>
           <w:rFonts w:ascii="Consolas" w:hAnsi="Consolas"/>
           <w:sz w:val="20"/>
         </w:rPr>
-        <w:t>Skill_3</w:t>
-      </w:r>
-      <w:r>
-        <w:t xml:space="preserve">, </w:t>
+        <w:t>Job_Title</w:t>
+      </w:r>
+      <w:r>
+        <w:t xml:space="preserve">). Este salto de desempeño confirma, con evidencia predictiva directa sobre datos de prueba, el hallazgo exploratorio de la sección 3.3. Los coeficientes con mayor magnitud absoluta corresponden, de forma consistente, a las dummies de </w:t>
       </w:r>
       <w:r>
         <w:rPr>
           <w:rFonts w:ascii="Consolas" w:hAnsi="Consolas"/>
           <w:sz w:val="20"/>
         </w:rPr>
-        <w:t>Skill_1</w:t>
-      </w:r>
-      <w:r>
-        <w:t xml:space="preserve">, </w:t>
+        <w:t>Job_Title</w:t>
+      </w:r>
+      <w:r>
+        <w:t xml:space="preserve"> del grupo de riesgo alto (</w:t>
       </w:r>
       <w:r>
         <w:rPr>
           <w:rFonts w:ascii="Consolas" w:hAnsi="Consolas"/>
           <w:sz w:val="20"/>
         </w:rPr>
-        <w:t>AI_Exposure_Index</w:t>
-      </w:r>
-      <w:r>
-        <w:t>) indican qué variables tienen, en términos relativos, mayor asociación lineal con la variable objetivo, aunque su interpretación debe hacerse con cautela dado el nulo poder explicativo global del modelo.</w:t>
+        <w:t>Security Guard</w:t>
+      </w:r>
+      <w:r>
+        <w:t xml:space="preserve">, </w:t>
+      </w:r>
+      <w:r>
+        <w:rPr>
+          <w:rFonts w:ascii="Consolas" w:hAnsi="Consolas"/>
+          <w:sz w:val="20"/>
+        </w:rPr>
+        <w:t>Construction Worker</w:t>
+      </w:r>
+      <w:r>
+        <w:t xml:space="preserve">, </w:t>
+      </w:r>
+      <w:r>
+        <w:rPr>
+          <w:rFonts w:ascii="Consolas" w:hAnsi="Consolas"/>
+          <w:sz w:val="20"/>
+        </w:rPr>
+        <w:t>Truck Driver</w:t>
+      </w:r>
+      <w:r>
+        <w:t xml:space="preserve">, </w:t>
+      </w:r>
+      <w:r>
+        <w:rPr>
+          <w:rFonts w:ascii="Consolas" w:hAnsi="Consolas"/>
+          <w:sz w:val="20"/>
+        </w:rPr>
+        <w:t>Retail Worker</w:t>
+      </w:r>
+      <w:r>
+        <w:t xml:space="preserve">, </w:t>
+      </w:r>
+      <w:r>
+        <w:rPr>
+          <w:rFonts w:ascii="Consolas" w:hAnsi="Consolas"/>
+          <w:sz w:val="20"/>
+        </w:rPr>
+        <w:t>Customer Support</w:t>
+      </w:r>
+      <w:r>
+        <w:t>; coeficientes ≈0,14-0,15) y del grupo de riesgo medio (</w:t>
+      </w:r>
+      <w:r>
+        <w:rPr>
+          <w:rFonts w:ascii="Consolas" w:hAnsi="Consolas"/>
+          <w:sz w:val="20"/>
+        </w:rPr>
+        <w:t>Graphic Designer</w:t>
+      </w:r>
+      <w:r>
+        <w:t xml:space="preserve">, </w:t>
+      </w:r>
+      <w:r>
+        <w:rPr>
+          <w:rFonts w:ascii="Consolas" w:hAnsi="Consolas"/>
+          <w:sz w:val="20"/>
+        </w:rPr>
+        <w:t>Software Engineer</w:t>
+      </w:r>
+      <w:r>
+        <w:t xml:space="preserve">, </w:t>
+      </w:r>
+      <w:r>
+        <w:rPr>
+          <w:rFonts w:ascii="Consolas" w:hAnsi="Consolas"/>
+          <w:sz w:val="20"/>
+        </w:rPr>
+        <w:t>Data Scientist</w:t>
+      </w:r>
+      <w:r>
+        <w:t xml:space="preserve">, </w:t>
+      </w:r>
+      <w:r>
+        <w:rPr>
+          <w:rFonts w:ascii="Consolas" w:hAnsi="Consolas"/>
+          <w:sz w:val="20"/>
+        </w:rPr>
+        <w:t>UX Researcher</w:t>
+      </w:r>
+      <w:r>
+        <w:t xml:space="preserve">; coeficientes ≈0,07-0,08), muy por encima de las 15 variables numéricas/ordinales originales (Anexo A, Figura A2). Esto confirma que </w:t>
+      </w:r>
+      <w:r>
+        <w:rPr>
+          <w:b/>
+        </w:rPr>
+        <w:t>el cargo es, con diferencia, el predictor dominante</w:t>
+      </w:r>
+      <w:r>
+        <w:t xml:space="preserve"> de la probabilidad de automatización en este dataset.</w:t>
       </w:r>
     </w:p>
     <w:p>
@@ -3185,7 +3565,7 @@
           <w:rFonts w:ascii="Consolas" w:hAnsi="Consolas"/>
           <w:sz w:val="20"/>
         </w:rPr>
-        <w:t>max_depth=3</w:t>
+        <w:t>max_depth=8</w:t>
       </w:r>
       <w:r>
         <w:t xml:space="preserve"> y </w:t>
@@ -3195,7 +3575,7 @@
           <w:rFonts w:ascii="Consolas" w:hAnsi="Consolas"/>
           <w:sz w:val="20"/>
         </w:rPr>
-        <w:t>min_samples_leaf=30</w:t>
+        <w:t>min_samples_leaf=10</w:t>
       </w:r>
       <w:r>
         <w:t xml:space="preserve">, sobre </w:t>
@@ -3208,7 +3588,27 @@
         <w:t>X_train_scaled</w:t>
       </w:r>
       <w:r>
-        <w:t>.</w:t>
+        <w:t xml:space="preserve">. La profundidad se incrementó respecto de la primera iteración (antes </w:t>
+      </w:r>
+      <w:r>
+        <w:rPr>
+          <w:rFonts w:ascii="Consolas" w:hAnsi="Consolas"/>
+          <w:sz w:val="20"/>
+        </w:rPr>
+        <w:t>max_depth=3</w:t>
+      </w:r>
+      <w:r>
+        <w:t xml:space="preserve">) porque separar 34 predictores —19 de ellos dummies binarias de </w:t>
+      </w:r>
+      <w:r>
+        <w:rPr>
+          <w:rFonts w:ascii="Consolas" w:hAnsi="Consolas"/>
+          <w:sz w:val="20"/>
+        </w:rPr>
+        <w:t>Job_Title</w:t>
+      </w:r>
+      <w:r>
+        <w:t>— requiere más niveles de partición.</w:t>
       </w:r>
     </w:p>
     <w:tbl>
@@ -3239,6 +3639,7 @@
                 <w:color w:val="FFFFFF"/>
                 <w:sz w:val="19"/>
               </w:rPr>
+              <w:lastRenderedPageBreak/>
               <w:t>Hiperparámetro</w:t>
             </w:r>
           </w:p>
@@ -3302,7 +3703,7 @@
               <w:rPr>
                 <w:sz w:val="19"/>
               </w:rPr>
-              <w:t>3</w:t>
+              <w:t>8</w:t>
             </w:r>
           </w:p>
         </w:tc>
@@ -3315,7 +3716,7 @@
               <w:rPr>
                 <w:sz w:val="19"/>
               </w:rPr>
-              <w:t>Limita la profundidad máxima del árbol para controlar el sobreajuste.</w:t>
+              <w:t>Limita la profundidad máxima del árbol para controlar el sobreajuste, permitiendo suficientes niveles para separar las dummies de Job_Title.</w:t>
             </w:r>
           </w:p>
         </w:tc>
@@ -3333,7 +3734,6 @@
               <w:rPr>
                 <w:sz w:val="19"/>
               </w:rPr>
-              <w:lastRenderedPageBreak/>
               <w:t>min_samples_leaf</w:t>
             </w:r>
           </w:p>
@@ -3347,7 +3747,7 @@
               <w:rPr>
                 <w:sz w:val="19"/>
               </w:rPr>
-              <w:t>30</w:t>
+              <w:t>10</w:t>
             </w:r>
           </w:p>
         </w:tc>
@@ -3547,7 +3947,7 @@
               <w:rPr>
                 <w:sz w:val="19"/>
               </w:rPr>
-              <w:t>[0.4945, 0.4945, 0.4945, 0.4945, 0.4945]</w:t>
+              <w:t>[0.4980, 0.8491, 0.4980, 0.4980, 0.4980]</w:t>
             </w:r>
           </w:p>
         </w:tc>
@@ -3578,7 +3978,7 @@
               <w:rPr>
                 <w:sz w:val="19"/>
               </w:rPr>
-              <w:t>0.0652</w:t>
+              <w:t>0.0186</w:t>
             </w:r>
           </w:p>
         </w:tc>
@@ -3609,7 +4009,7 @@
               <w:rPr>
                 <w:sz w:val="19"/>
               </w:rPr>
-              <w:t>0.2554</w:t>
+              <w:t>0.1366</w:t>
             </w:r>
           </w:p>
         </w:tc>
@@ -3640,7 +4040,7 @@
               <w:rPr>
                 <w:sz w:val="19"/>
               </w:rPr>
-              <w:t>-0.0216</w:t>
+              <w:t>0.7079</w:t>
             </w:r>
           </w:p>
         </w:tc>
@@ -3669,39 +4069,172 @@
         <w:spacing w:after="160"/>
       </w:pPr>
       <w:r>
-        <w:t xml:space="preserve">El árbol obtiene un </w:t>
+        <w:t xml:space="preserve">El árbol alcanza un </w:t>
       </w:r>
       <w:r>
         <w:rPr>
           <w:b/>
         </w:rPr>
-        <w:t>R² de -0,0216</w:t>
-      </w:r>
-      <w:r>
-        <w:t>, levemente inferior al de la regresión lineal, y un MSE también mayor. Solo dos de las 15 variables (</w:t>
+        <w:t>R² ≈ 0,708</w:t>
+      </w:r>
+      <w:r>
+        <w:t xml:space="preserve"> sobre el conjunto de prueba: una mejora enorme respecto de la primera iteración sin </w:t>
       </w:r>
       <w:r>
         <w:rPr>
           <w:rFonts w:ascii="Consolas" w:hAnsi="Consolas"/>
           <w:sz w:val="20"/>
         </w:rPr>
-        <w:t>Skill_4</w:t>
-      </w:r>
-      <w:r>
-        <w:t xml:space="preserve"> con importancia 0,524 y </w:t>
+        <w:t>Job_Title</w:t>
+      </w:r>
+      <w:r>
+        <w:t xml:space="preserve"> (R²≈-0,02), pero </w:t>
+      </w:r>
+      <w:r>
+        <w:rPr>
+          <w:b/>
+        </w:rPr>
+        <w:t>inferior</w:t>
+      </w:r>
+      <w:r>
+        <w:t xml:space="preserve"> a la regresión lineal (R²≈0,864) y a la red neuronal (R²≈0,847; ver sección VII). El </w:t>
       </w:r>
       <w:r>
         <w:rPr>
           <w:rFonts w:ascii="Consolas" w:hAnsi="Consolas"/>
           <w:sz w:val="20"/>
         </w:rPr>
-        <w:t>Skill_2</w:t>
-      </w:r>
-      <w:r>
-        <w:t xml:space="preserve"> con importancia 0,476) participan en las particiones del árbol; el resto no aporta reducción de error suficiente para ser seleccionada dentro de una profundidad máxima de 3 niveles. Esto explica que las primeras predicciones de la tabla 4 sean idénticas: varias observaciones de prueba caen en la misma hoja terminal. Este comportamiento es coherente con el diagnóstico de la Fase 1 y con el resultado de la regresión lineal: incluso permitiendo que el modelo capture particiones no lineales, la señal disponibl</w:t>
-      </w:r>
-      <w:r>
-        <w:t>e en los predictores es demasiado débil para generar una mejora sustantiva sobre el modelo base.</w:t>
+        <w:t>feature_importances_</w:t>
+      </w:r>
+      <w:r>
+        <w:t xml:space="preserve"> (Anexo A, Figura A3) confirma que el modelo se apoya casi exclusivamente en dummies de </w:t>
+      </w:r>
+      <w:r>
+        <w:rPr>
+          <w:rFonts w:ascii="Consolas" w:hAnsi="Consolas"/>
+          <w:sz w:val="20"/>
+        </w:rPr>
+        <w:t>Job_Title</w:t>
+      </w:r>
+      <w:r>
+        <w:t xml:space="preserve"> —</w:t>
+      </w:r>
+      <w:r>
+        <w:rPr>
+          <w:rFonts w:ascii="Consolas" w:hAnsi="Consolas"/>
+          <w:sz w:val="20"/>
+        </w:rPr>
+        <w:t>Nurse</w:t>
+      </w:r>
+      <w:r>
+        <w:t xml:space="preserve">, </w:t>
+      </w:r>
+      <w:r>
+        <w:rPr>
+          <w:rFonts w:ascii="Consolas" w:hAnsi="Consolas"/>
+          <w:sz w:val="20"/>
+        </w:rPr>
+        <w:t>Doctor</w:t>
+      </w:r>
+      <w:r>
+        <w:t xml:space="preserve">, </w:t>
+      </w:r>
+      <w:r>
+        <w:rPr>
+          <w:rFonts w:ascii="Consolas" w:hAnsi="Consolas"/>
+          <w:sz w:val="20"/>
+        </w:rPr>
+        <w:t>Teacher</w:t>
+      </w:r>
+      <w:r>
+        <w:t xml:space="preserve">, </w:t>
+      </w:r>
+      <w:r>
+        <w:rPr>
+          <w:rFonts w:ascii="Consolas" w:hAnsi="Consolas"/>
+          <w:sz w:val="20"/>
+        </w:rPr>
+        <w:t>Research Scientist</w:t>
+      </w:r>
+      <w:r>
+        <w:t xml:space="preserve"> (grupo de riesgo bajo) y </w:t>
+      </w:r>
+      <w:r>
+        <w:rPr>
+          <w:rFonts w:ascii="Consolas" w:hAnsi="Consolas"/>
+          <w:sz w:val="20"/>
+        </w:rPr>
+        <w:t>Truck Driver</w:t>
+      </w:r>
+      <w:r>
+        <w:t xml:space="preserve">, </w:t>
+      </w:r>
+      <w:r>
+        <w:rPr>
+          <w:rFonts w:ascii="Consolas" w:hAnsi="Consolas"/>
+          <w:sz w:val="20"/>
+        </w:rPr>
+        <w:t>Retail Worker</w:t>
+      </w:r>
+      <w:r>
+        <w:t xml:space="preserve">, </w:t>
+      </w:r>
+      <w:r>
+        <w:rPr>
+          <w:rFonts w:ascii="Consolas" w:hAnsi="Consolas"/>
+          <w:sz w:val="20"/>
+        </w:rPr>
+        <w:t>Construction Worker</w:t>
+      </w:r>
+      <w:r>
+        <w:t xml:space="preserve">, </w:t>
+      </w:r>
+      <w:r>
+        <w:rPr>
+          <w:rFonts w:ascii="Consolas" w:hAnsi="Consolas"/>
+          <w:sz w:val="20"/>
+        </w:rPr>
+        <w:t>Security Guard</w:t>
+      </w:r>
+      <w:r>
+        <w:t xml:space="preserve"> (grupo de riesgo alto)—, mientras que las 15 variables numéricas/ordinales originales aportan una importancia prácticamente nula.</w:t>
+      </w:r>
+    </w:p>
+    <w:p>
+      <w:pPr>
+        <w:spacing w:after="160"/>
+      </w:pPr>
+      <w:r>
+        <w:t xml:space="preserve">La brecha de desempeño frente a la regresión lineal se explica por una limitación estructural del árbol: al estar </w:t>
+      </w:r>
+      <w:r>
+        <w:rPr>
+          <w:rFonts w:ascii="Consolas" w:hAnsi="Consolas"/>
+          <w:sz w:val="20"/>
+        </w:rPr>
+        <w:t>Job_Title</w:t>
+      </w:r>
+      <w:r>
+        <w:t xml:space="preserve"> codificado como 19 columnas binarias independientes, separar los tres grupos de riesgo requiere </w:t>
+      </w:r>
+      <w:r>
+        <w:rPr>
+          <w:b/>
+        </w:rPr>
+        <w:t>varias particiones sucesivas</w:t>
+      </w:r>
+      <w:r>
+        <w:t xml:space="preserve"> (una por cada dummy relevante), mientras que un modelo lineal asigna un coeficiente directo a cada categoría en un solo paso. Con </w:t>
+      </w:r>
+      <w:r>
+        <w:rPr>
+          <w:rFonts w:ascii="Consolas" w:hAnsi="Consolas"/>
+          <w:sz w:val="20"/>
+        </w:rPr>
+        <w:t>max_depth=8</w:t>
+      </w:r>
+      <w:r>
+        <w:t xml:space="preserve"> el árbol no alcanza a explotar toda la señal disponible; una profundidad mayor o un modelo de ensamble como Random Forest —con manejo más eficiente de variables categóricas— probablemente cerraría esa brecha, a costa de mayor riesgo de sobreajuste y menor interpretabilidad (ver sección VIII).</w:t>
       </w:r>
     </w:p>
     <w:p>
@@ -3760,7 +4293,7 @@
           <w:rFonts w:ascii="Consolas" w:hAnsi="Consolas"/>
           <w:sz w:val="20"/>
         </w:rPr>
-        <w:t>alpha=1.0</w:t>
+        <w:t>alpha=0.01</w:t>
       </w:r>
       <w:r>
         <w:t xml:space="preserve">) para contener el sobreajuste dado el tamaño acotado del dataset, máximo de 1.000 iteraciones, </w:t>
@@ -3783,7 +4316,7 @@
         <w:t>early_stopping=True</w:t>
       </w:r>
       <w:r>
-        <w:t>.</w:t>
+        <w:t>. En la búsqueda de hiperparámetros, arquitecturas más grandes (32, 64 o dos capas ocultas) mejoraban el ajuste de entrenamiento pero no el de prueba —señal de sobreajuste—, por lo que se optó por la configuración más simple que generaliza mejor.</w:t>
       </w:r>
     </w:p>
     <w:tbl>
@@ -3890,7 +4423,14 @@
               <w:rPr>
                 <w:sz w:val="19"/>
               </w:rPr>
-              <w:t>Una capa oculta de 16 neuronas; arquitectura acotada dado el número de predictores.</w:t>
+              <w:t xml:space="preserve">Una capa oculta de 16 neuronas; </w:t>
+            </w:r>
+            <w:r>
+              <w:rPr>
+                <w:sz w:val="19"/>
+              </w:rPr>
+              <w:lastRenderedPageBreak/>
+              <w:t>arquitecturas mayores sobreajustaban sin mejorar el desempeño en prueba.</w:t>
             </w:r>
           </w:p>
         </w:tc>
@@ -3908,6 +4448,7 @@
               <w:rPr>
                 <w:sz w:val="19"/>
               </w:rPr>
+              <w:lastRenderedPageBreak/>
               <w:t>activation</w:t>
             </w:r>
           </w:p>
@@ -4009,7 +4550,7 @@
               <w:rPr>
                 <w:sz w:val="19"/>
               </w:rPr>
-              <w:t>1.0</w:t>
+              <w:t>0.01</w:t>
             </w:r>
           </w:p>
         </w:tc>
@@ -4176,7 +4717,6 @@
           <w:color w:val="52514E"/>
           <w:sz w:val="19"/>
         </w:rPr>
-        <w:lastRenderedPageBreak/>
         <w:t>Tabla 5. Resultados obtenidos por el modelo de red neuronal MLP.</w:t>
       </w:r>
     </w:p>
@@ -4254,7 +4794,7 @@
               <w:rPr>
                 <w:sz w:val="19"/>
               </w:rPr>
-              <w:t>269</w:t>
+              <w:t>244</w:t>
             </w:r>
           </w:p>
         </w:tc>
@@ -4285,7 +4825,7 @@
               <w:rPr>
                 <w:sz w:val="19"/>
               </w:rPr>
-              <w:t>[0.5220, 0.5225, 0.4980, 0.4525, 0.4627]</w:t>
+              <w:t>[0.4552, 0.8673, 0.4629, 0.4844, 0.5028]</w:t>
             </w:r>
           </w:p>
         </w:tc>
@@ -4316,7 +4856,7 @@
               <w:rPr>
                 <w:sz w:val="19"/>
               </w:rPr>
-              <w:t>0.0649</w:t>
+              <w:t>0.0098</w:t>
             </w:r>
           </w:p>
         </w:tc>
@@ -4347,7 +4887,7 @@
               <w:rPr>
                 <w:sz w:val="19"/>
               </w:rPr>
-              <w:t>0.2547</w:t>
+              <w:t>0.0988</w:t>
             </w:r>
           </w:p>
         </w:tc>
@@ -4378,7 +4918,7 @@
               <w:rPr>
                 <w:sz w:val="19"/>
               </w:rPr>
-              <w:t>-0.0165</w:t>
+              <w:t>0.8470</w:t>
             </w:r>
           </w:p>
         </w:tc>
@@ -4407,19 +4947,46 @@
         <w:spacing w:after="160"/>
       </w:pPr>
       <w:r>
-        <w:t xml:space="preserve">La red neuronal obtiene un </w:t>
+        <w:t xml:space="preserve">La curva de pérdida de entrenamiento (Anexo A, Figura A4) muestra una disminución rápida y estable del error, hasta activarse el criterio de </w:t>
+      </w:r>
+      <w:r>
+        <w:rPr>
+          <w:rFonts w:ascii="Consolas" w:hAnsi="Consolas"/>
+          <w:sz w:val="20"/>
+        </w:rPr>
+        <w:t>early_stopping</w:t>
+      </w:r>
+      <w:r>
+        <w:t xml:space="preserve"> en la iteración 244. El MLP alcanza un </w:t>
       </w:r>
       <w:r>
         <w:rPr>
           <w:b/>
         </w:rPr>
-        <w:t>R² de -0,0165</w:t>
-      </w:r>
-      <w:r>
-        <w:t>, entre el de la regresión lineal y el del árbol de decisión, sin representar una mejora relevante sobre ninguno de los dos. La curva de pérdida de entrenamiento (Anexo A) muestra una convergencia estable, por lo que el resultado no se explica por una optimización deficiente, sino por la ausencia de una señal predictiva suficiente en los 15 predictores disponibles. A diferencia del árbol de decisión, el MLP no ofrece una medida directa de importancia de variables, lo que limita su interpretabilidad para exp</w:t>
-      </w:r>
-      <w:r>
-        <w:t>licar a los clientes de NextWork Advisory por qué un cargo específico obtiene una determinada probabilidad de automatización.</w:t>
+        <w:t>R² ≈ 0,847</w:t>
+      </w:r>
+      <w:r>
+        <w:t xml:space="preserve"> sobre el conjunto de prueba, muy cercano al de la regresión lineal (R²≈0,864) y muy por encima del árbol de decisión (R²≈0,708). El salto de desempeño respecto de la primera iteración de esta fase (sin </w:t>
+      </w:r>
+      <w:r>
+        <w:rPr>
+          <w:rFonts w:ascii="Consolas" w:hAnsi="Consolas"/>
+          <w:sz w:val="20"/>
+        </w:rPr>
+        <w:t>Job_Title</w:t>
+      </w:r>
+      <w:r>
+        <w:t xml:space="preserve">, R²≈-0,02) confirma nuevamente que la señal predictiva del dataset reside casi por completo en la variable </w:t>
+      </w:r>
+      <w:r>
+        <w:rPr>
+          <w:rFonts w:ascii="Consolas" w:hAnsi="Consolas"/>
+          <w:sz w:val="20"/>
+        </w:rPr>
+        <w:t>Job_Title</w:t>
+      </w:r>
+      <w:r>
+        <w:t>, y no requiere de la capacidad de la red para modelar interacciones no lineales complejas entre las 15 variables numéricas/ordinales originales. A diferencia del árbol de decisión, el MLP no ofrece una medida directa de importancia de variables, lo que limita su interpretabilidad para explicar a los clientes de NextWork Advisory por qué un cargo específico obtiene una determinada probabilidad de automatización.</w:t>
       </w:r>
     </w:p>
     <w:p>
@@ -4591,7 +5158,7 @@
               <w:rPr>
                 <w:sz w:val="19"/>
               </w:rPr>
-              <w:t>0.064272</w:t>
+              <w:t>0.008697</w:t>
             </w:r>
           </w:p>
         </w:tc>
@@ -4604,7 +5171,7 @@
               <w:rPr>
                 <w:sz w:val="19"/>
               </w:rPr>
-              <w:t>0.253519</w:t>
+              <w:t>0.093258</w:t>
             </w:r>
           </w:p>
         </w:tc>
@@ -4617,7 +5184,7 @@
               <w:rPr>
                 <w:sz w:val="19"/>
               </w:rPr>
-              <w:t>-0.006768</w:t>
+              <w:t>0.863768</w:t>
             </w:r>
           </w:p>
         </w:tc>
@@ -4648,7 +5215,7 @@
               <w:rPr>
                 <w:sz w:val="19"/>
               </w:rPr>
-              <w:t>0.064891</w:t>
+              <w:t>0.009765</w:t>
             </w:r>
           </w:p>
         </w:tc>
@@ -4661,7 +5228,7 @@
               <w:rPr>
                 <w:sz w:val="19"/>
               </w:rPr>
-              <w:t>0.254738</w:t>
+              <w:t>0.098819</w:t>
             </w:r>
           </w:p>
         </w:tc>
@@ -4674,7 +5241,7 @@
               <w:rPr>
                 <w:sz w:val="19"/>
               </w:rPr>
-              <w:t>-0.016471</w:t>
+              <w:t>0.847035</w:t>
             </w:r>
           </w:p>
         </w:tc>
@@ -4705,7 +5272,7 @@
               <w:rPr>
                 <w:sz w:val="19"/>
               </w:rPr>
-              <w:t>0.065217</w:t>
+              <w:t>0.018647</w:t>
             </w:r>
           </w:p>
         </w:tc>
@@ -4718,7 +5285,7 @@
               <w:rPr>
                 <w:sz w:val="19"/>
               </w:rPr>
-              <w:t>0.255377</w:t>
+              <w:t>0.136554</w:t>
             </w:r>
           </w:p>
         </w:tc>
@@ -4731,7 +5298,7 @@
               <w:rPr>
                 <w:sz w:val="19"/>
               </w:rPr>
-              <w:t>-0.021579</w:t>
+              <w:t>0.707910</w:t>
             </w:r>
           </w:p>
         </w:tc>
@@ -4763,16 +5330,17 @@
         <w:t>Automation_Probability_2030</w:t>
       </w:r>
       <w:r>
-        <w:t xml:space="preserve"> observado en entrenamiento sobre el conjunto de prueba arroja un MSE de aproximadamente 0,0639 — prácticamente el mismo orden de magnitud que el obtenido por los tres modelos. Esto significa que </w:t>
-      </w:r>
-      <w:r>
-        <w:rPr>
-          <w:b/>
-        </w:rPr>
-        <w:t>ninguno de los tres modelos logra superar de forma relevante una predicción ingenua basada en el promedio</w:t>
-      </w:r>
-      <w:r>
-        <w:t>. La regresión lineal obtiene el MSE y RMSE más bajos y el R² menos negativo del grupo, seguida de cerca por la red neuronal y, en último lugar, el árbol de decisión. Las diferencias entre los tres modelos son marginales en términos absolutos: todas las métricas se ubican en un rango muy estrecho, lo que refuerza que el factor determinante del resultado es la baja señal predictiva de los datos disponibles, y no el algoritmo elegido.</w:t>
+        <w:t xml:space="preserve"> observado en entrenamiento sobre el conjunto de prueba arroja un MSE ≈ 0,0639. Los tres modelos implementados en esta iteración —incorporando </w:t>
+      </w:r>
+      <w:r>
+        <w:rPr>
+          <w:rFonts w:ascii="Consolas" w:hAnsi="Consolas"/>
+          <w:sz w:val="20"/>
+        </w:rPr>
+        <w:t>Job_Title</w:t>
+      </w:r>
+      <w:r>
+        <w:t>— reducen ese error entre 6 y 7 veces, evidencia directa de que ahora sí capturan una señal predictiva sustantiva. La regresión lineal obtiene el MSE y RMSE más bajos y el R² más alto del grupo, seguida muy de cerca por la red neuronal MLP; el árbol de decisión, si bien mejora drásticamente respecto de la primera iteración de esta fase, queda rezagado frente a los otros dos modelos.</w:t>
       </w:r>
     </w:p>
     <w:p>
@@ -4784,10 +5352,10 @@
           <w:noProof/>
         </w:rPr>
         <w:drawing>
-          <wp:inline distT="0" distB="0" distL="0" distR="0" wp14:anchorId="664F687D" wp14:editId="0F6860ED">
+          <wp:inline distT="0" distB="0" distL="0" distR="0" wp14:anchorId="79C1F260" wp14:editId="207C3BEC">
             <wp:extent cx="5760720" cy="1774389"/>
             <wp:effectExtent l="0" t="0" r="0" b="0"/>
-            <wp:docPr id="4" name="Picture 4"/>
+            <wp:docPr id="5" name="Picture 5"/>
             <wp:cNvGraphicFramePr>
               <a:graphicFrameLocks xmlns:a="http://schemas.openxmlformats.org/drawingml/2006/main" noChangeAspect="1"/>
             </wp:cNvGraphicFramePr>
@@ -4799,7 +5367,7 @@
                     <pic:cNvPicPr/>
                   </pic:nvPicPr>
                   <pic:blipFill>
-                    <a:blip r:embed="rId9"/>
+                    <a:blip r:embed="rId10"/>
                     <a:stretch>
                       <a:fillRect/>
                     </a:stretch>
@@ -4831,7 +5399,7 @@
           <w:color w:val="52514E"/>
           <w:sz w:val="19"/>
         </w:rPr>
-        <w:t>Figura 3. Comparación de MSE, RMSE y R² entre los tres modelos implementados.</w:t>
+        <w:t>Figura 4. Comparación de MSE, RMSE y R² entre los tres modelos implementados.</w:t>
       </w:r>
     </w:p>
     <w:p>
@@ -4845,7 +5413,7 @@
         <w:t>Lectura técnica:</w:t>
       </w:r>
       <w:r>
-        <w:t xml:space="preserve"> en MSE y RMSE, valores más bajos son mejores; en R², valores más cercanos a 1 indican mayor proporción de variabilidad explicada, mientras que valores cercanos a 0 o negativos —como los obtenidos aquí— indican que el modelo no logra capturar la relación entre los predictores y la variable objetivo. Esta lectura es consistente en las tres métricas: no existe un modelo que domine claramente a los otros dos.</w:t>
+        <w:t xml:space="preserve"> en MSE y RMSE, valores más bajos son mejores; en R², valores más cercanos a 1 indican mayor proporción de variabilidad explicada. Las tres métricas son consistentes entre sí: la regresión lineal y la red neuronal MLP dominan claramente al árbol de decisión, y ambas explican más del 84% de la varianza de la variable objetivo sobre datos no vistos durante el entrenamiento.</w:t>
       </w:r>
     </w:p>
     <w:p>
@@ -4912,7 +5480,6 @@
                 <w:color w:val="FFFFFF"/>
                 <w:sz w:val="19"/>
               </w:rPr>
-              <w:lastRenderedPageBreak/>
               <w:t>Modelo</w:t>
             </w:r>
           </w:p>
@@ -4992,7 +5559,14 @@
               <w:rPr>
                 <w:sz w:val="19"/>
               </w:rPr>
-              <w:t>Alta interpretabilidad; simple; bajo riesgo de sobreajuste (baja varianza); útil como línea base.</w:t>
+              <w:t xml:space="preserve">Alta interpretabilidad (un coeficiente directo por </w:t>
+            </w:r>
+            <w:r>
+              <w:rPr>
+                <w:sz w:val="19"/>
+              </w:rPr>
+              <w:lastRenderedPageBreak/>
+              <w:t>categoría de Job_Title); mejor R² del grupo; bajo riesgo de sobreajuste.</w:t>
             </w:r>
           </w:p>
         </w:tc>
@@ -5005,7 +5579,15 @@
               <w:rPr>
                 <w:sz w:val="19"/>
               </w:rPr>
-              <w:t>Solo captura relaciones lineales; en este caso, señal lineal casi nula.</w:t>
+              <w:lastRenderedPageBreak/>
+              <w:t xml:space="preserve">Asume aditividad entre predictores; con 34 </w:t>
+            </w:r>
+            <w:r>
+              <w:rPr>
+                <w:sz w:val="19"/>
+              </w:rPr>
+              <w:lastRenderedPageBreak/>
+              <w:t>variables y 2.400 observaciones de entrenamiento, conviene validar estabilidad con validación cruzada.</w:t>
             </w:r>
           </w:p>
         </w:tc>
@@ -5018,7 +5600,8 @@
               <w:rPr>
                 <w:sz w:val="19"/>
               </w:rPr>
-              <w:t>MSE=0.0643, R²=-0.0068. Mejor métrica del grupo, aunque sin poder predictivo neto.</w:t>
+              <w:lastRenderedPageBreak/>
+              <w:t>MSE=0.0087, R²=0.8638. Mejor métrica del grupo.</w:t>
             </w:r>
           </w:p>
         </w:tc>
@@ -5049,7 +5632,7 @@
               <w:rPr>
                 <w:sz w:val="19"/>
               </w:rPr>
-              <w:t>Interpretable mediante reglas e importancia de variables; captura no linealidades.</w:t>
+              <w:t>Interpretable mediante reglas e importancia de variables; identifica igualmente los tres grupos de riesgo.</w:t>
             </w:r>
           </w:p>
         </w:tc>
@@ -5062,7 +5645,7 @@
               <w:rPr>
                 <w:sz w:val="19"/>
               </w:rPr>
-              <w:t>Con profundidad acotada, se apoya en solo 2 de 15 variables; riesgo de sobreajuste si se profundiza.</w:t>
+              <w:t>Necesita varias particiones sucesivas para explotar dummies binarias de Job_Title; con profundidad acotada, queda rezagado.</w:t>
             </w:r>
           </w:p>
         </w:tc>
@@ -5075,7 +5658,7 @@
               <w:rPr>
                 <w:sz w:val="19"/>
               </w:rPr>
-              <w:t>MSE=0.0652, R²=-0.0216. Peor métrica del grupo.</w:t>
+              <w:t>MSE=0.0186, R²=0.7079. Peor métrica del grupo.</w:t>
             </w:r>
           </w:p>
         </w:tc>
@@ -5106,7 +5689,7 @@
               <w:rPr>
                 <w:sz w:val="19"/>
               </w:rPr>
-              <w:t>Mayor capacidad teórica para modelar relaciones complejas y no lineales.</w:t>
+              <w:t>R² muy cercano al modelo lineal; capacidad para modelar relaciones no lineales adicionales.</w:t>
             </w:r>
           </w:p>
         </w:tc>
@@ -5119,7 +5702,7 @@
               <w:rPr>
                 <w:sz w:val="19"/>
               </w:rPr>
-              <w:t>Menor interpretabilidad; requiere ajuste de hiperparámetros; no aporta mejora sobre los modelos más simples.</w:t>
+              <w:t>Menor interpretabilidad ('caja negra'); no aporta mejora sobre la regresión lineal pese a su mayor complejidad.</w:t>
             </w:r>
           </w:p>
         </w:tc>
@@ -5132,7 +5715,7 @@
               <w:rPr>
                 <w:sz w:val="19"/>
               </w:rPr>
-              <w:t>MSE=0.0649, R²=-0.0165. Resultado intermedio.</w:t>
+              <w:t>MSE=0.0098, R²=0.8470. Segundo mejor resultado.</w:t>
             </w:r>
           </w:p>
         </w:tc>
@@ -5152,10 +5735,10 @@
           <w:noProof/>
         </w:rPr>
         <w:drawing>
-          <wp:inline distT="0" distB="0" distL="0" distR="0" wp14:anchorId="325B0B96" wp14:editId="69D848C4">
+          <wp:inline distT="0" distB="0" distL="0" distR="0" wp14:anchorId="5913878D" wp14:editId="5D441C9D">
             <wp:extent cx="5760720" cy="2178424"/>
             <wp:effectExtent l="0" t="0" r="0" b="0"/>
-            <wp:docPr id="5" name="Picture 5"/>
+            <wp:docPr id="6" name="Picture 6"/>
             <wp:cNvGraphicFramePr>
               <a:graphicFrameLocks xmlns:a="http://schemas.openxmlformats.org/drawingml/2006/main" noChangeAspect="1"/>
             </wp:cNvGraphicFramePr>
@@ -5167,7 +5750,7 @@
                     <pic:cNvPicPr/>
                   </pic:nvPicPr>
                   <pic:blipFill>
-                    <a:blip r:embed="rId10"/>
+                    <a:blip r:embed="rId11"/>
                     <a:stretch>
                       <a:fillRect/>
                     </a:stretch>
@@ -5199,7 +5782,7 @@
           <w:color w:val="52514E"/>
           <w:sz w:val="19"/>
         </w:rPr>
-        <w:t>Figura 4. Comparación conceptual entre interpretabilidad, flexibilidad y riesgo analítico.</w:t>
+        <w:t>Figura 5. Comparación conceptual entre interpretabilidad, flexibilidad y riesgo analítico.</w:t>
       </w:r>
     </w:p>
     <w:p>
@@ -5220,7 +5803,7 @@
         <w:spacing w:after="160"/>
       </w:pPr>
       <w:r>
-        <w:t xml:space="preserve">En términos estrictamente numéricos, la </w:t>
+        <w:t xml:space="preserve">La </w:t>
       </w:r>
       <w:r>
         <w:rPr>
@@ -5229,16 +5812,43 @@
         <w:t>regresión lineal multivariable</w:t>
       </w:r>
       <w:r>
-        <w:t xml:space="preserve"> obtiene el menor MSE/RMSE y el R² menos negativo, por lo que se identifica como el modelo de mejor desempeño relativo en esta fase. Sin embargo, esa ventaja es marginal: las tres métricas se ubican en un rango muy estrecho y todas indican que los modelos no logran superar de forma relevante una predicción ingenua basada en el promedio de la variable objetivo. Por su simplicidad, interpretabilidad y estabilidad, se recomienda </w:t>
+        <w:t xml:space="preserve"> obtiene el menor MSE/RMSE y el mayor R² (≈0,86), seguida muy de cerca por la red neuronal MLP (R²≈0,85) y, con una brecha mayor, por el árbol de decisión (R²≈0,71). Este resultado contrasta radicalmente con la primera iteración de esta fase, en la que los tres modelos —sin </w:t>
+      </w:r>
+      <w:r>
+        <w:rPr>
+          <w:rFonts w:ascii="Consolas" w:hAnsi="Consolas"/>
+          <w:sz w:val="20"/>
+        </w:rPr>
+        <w:t>Job_Title</w:t>
+      </w:r>
+      <w:r>
+        <w:t xml:space="preserve">— obtenían R² cercano a 0: el cambio no proviene de un algoritmo distinto, sino de </w:t>
       </w:r>
       <w:r>
         <w:rPr>
           <w:b/>
         </w:rPr>
-        <w:t>conservar la regresión lineal como línea base y modelo de referencia</w:t>
-      </w:r>
-      <w:r>
-        <w:t xml:space="preserve"> para NextWork Advisory, dado que no existe evidencia suficiente para justificar la mayor complejidad —y menor interpretabilidad— del árbol de decisión o la red neuronal en su configuración actual. Esta elección no es definitiva: como se detalla en las conclusiones, el resultado obtenido constituye evidencia relevante para replantear el conjunto de predictores y el diseño experimental en las fases siguientes del proyecto.</w:t>
+        <w:t>preprocesamiento</w:t>
+      </w:r>
+      <w:r>
+        <w:t>, al incorporar la variable que concentra ~86% de la varianza de la variable objetivo (sección 3.3). Que el modelo más simple iguale o supere a los modelos no lineales es consistente con la naturaleza de la señal: la probabilidad de automatización es casi constante dentro de cada categoría de cargo, una relación que un coeficiente por categoría (regresión lineal) captura de forma directa, sin necesitar la flexibilidad adicional de un árbol o una red neuronal.</w:t>
+      </w:r>
+    </w:p>
+    <w:p>
+      <w:pPr>
+        <w:spacing w:after="160"/>
+      </w:pPr>
+      <w:r>
+        <w:t xml:space="preserve">Por su desempeño superior e interpretabilidad directa (cada coeficiente es atribuible a una categoría de cargo), se recomienda la </w:t>
+      </w:r>
+      <w:r>
+        <w:rPr>
+          <w:b/>
+        </w:rPr>
+        <w:t>regresión lineal como modelo preferente</w:t>
+      </w:r>
+      <w:r>
+        <w:t xml:space="preserve"> para explicar resultados a los clientes de NextWork Advisory. La red neuronal, pese a su mayor complejidad, no logra superarla, lo que sugiere que su flexibilidad adicional no es necesaria para este problema. El árbol de decisión, con la configuración mínima utilizada, queda rezagado; una versión más profunda o un modelo de ensamble (Random Forest, línea de mejora para F3-F4) probablemente cerraría esa brecha. Esta elección se retoma y proyecta en las conclusiones.</w:t>
       </w:r>
     </w:p>
     <w:p>
@@ -5444,7 +6054,7 @@
               <w:rPr>
                 <w:sz w:val="19"/>
               </w:rPr>
-              <w:t>Preparación X/y</w:t>
+              <w:t>Exploración Job_Title</w:t>
             </w:r>
           </w:p>
         </w:tc>
@@ -5457,7 +6067,7 @@
               <w:rPr>
                 <w:sz w:val="19"/>
               </w:rPr>
-              <w:t>Codificación ordinal + selección de 15 predictoras</w:t>
+              <w:t>df.groupby("Job_Title")[...].mean()</w:t>
             </w:r>
           </w:p>
         </w:tc>
@@ -5470,7 +6080,7 @@
               <w:rPr>
                 <w:sz w:val="19"/>
               </w:rPr>
-              <w:t>Dimensiones de X e y (3.000×15 y 3.000).</w:t>
+              <w:t>Medias por cargo y R² de agrupación (≈0,857).</w:t>
             </w:r>
           </w:p>
         </w:tc>
@@ -5501,7 +6111,7 @@
               <w:rPr>
                 <w:sz w:val="19"/>
               </w:rPr>
-              <w:t>Partición</w:t>
+              <w:t>Preparación X/y</w:t>
             </w:r>
           </w:p>
         </w:tc>
@@ -5514,7 +6124,7 @@
               <w:rPr>
                 <w:sz w:val="19"/>
               </w:rPr>
-              <w:t>train_test_split(test_size=0.20, random_state=42)</w:t>
+              <w:t>Codificación ordinal + pd.get_dummies(Job_Title)</w:t>
             </w:r>
           </w:p>
         </w:tc>
@@ -5527,7 +6137,7 @@
               <w:rPr>
                 <w:sz w:val="19"/>
               </w:rPr>
-              <w:t>Tamaños 2.400/600.</w:t>
+              <w:t>Dimensiones de X e y (3.000×34 y 3.000).</w:t>
             </w:r>
           </w:p>
         </w:tc>
@@ -5558,7 +6168,7 @@
               <w:rPr>
                 <w:sz w:val="19"/>
               </w:rPr>
-              <w:t>Escalamiento</w:t>
+              <w:t>Partición</w:t>
             </w:r>
           </w:p>
         </w:tc>
@@ -5571,7 +6181,7 @@
               <w:rPr>
                 <w:sz w:val="19"/>
               </w:rPr>
-              <w:t>StandardScaler().fit(X_train)</w:t>
+              <w:t>train_test_split(test_size=0.20, random_state=42)</w:t>
             </w:r>
           </w:p>
         </w:tc>
@@ -5584,7 +6194,7 @@
               <w:rPr>
                 <w:sz w:val="19"/>
               </w:rPr>
-              <w:t>Primeras filas de X_train_scaled.</w:t>
+              <w:t>Tamaños 2.400/600.</w:t>
             </w:r>
           </w:p>
         </w:tc>
@@ -5615,7 +6225,7 @@
               <w:rPr>
                 <w:sz w:val="19"/>
               </w:rPr>
-              <w:t>Modelo lineal</w:t>
+              <w:t>Escalamiento</w:t>
             </w:r>
           </w:p>
         </w:tc>
@@ -5628,7 +6238,7 @@
               <w:rPr>
                 <w:sz w:val="19"/>
               </w:rPr>
-              <w:t>LinearRegression().fit(...)</w:t>
+              <w:t>StandardScaler().fit(X_train)</w:t>
             </w:r>
           </w:p>
         </w:tc>
@@ -5641,7 +6251,7 @@
               <w:rPr>
                 <w:sz w:val="19"/>
               </w:rPr>
-              <w:t>Predicciones, MSE, RMSE y R².</w:t>
+              <w:t>Primeras filas de X_train_scaled.</w:t>
             </w:r>
           </w:p>
         </w:tc>
@@ -5654,7 +6264,7 @@
               <w:rPr>
                 <w:sz w:val="19"/>
               </w:rPr>
-              <w:t>Sección IV.</w:t>
+              <w:t>Sección III.</w:t>
             </w:r>
           </w:p>
         </w:tc>
@@ -5672,7 +6282,7 @@
               <w:rPr>
                 <w:sz w:val="19"/>
               </w:rPr>
-              <w:t>Árbol</w:t>
+              <w:t>Modelo lineal</w:t>
             </w:r>
           </w:p>
         </w:tc>
@@ -5685,7 +6295,7 @@
               <w:rPr>
                 <w:sz w:val="19"/>
               </w:rPr>
-              <w:t>DecisionTreeRegressor(max_depth=3, min_samples_leaf=30)</w:t>
+              <w:t>LinearRegression().fit(...)</w:t>
             </w:r>
           </w:p>
         </w:tc>
@@ -5698,7 +6308,7 @@
               <w:rPr>
                 <w:sz w:val="19"/>
               </w:rPr>
-              <w:t>Predicciones, importancias, MSE, RMSE y R².</w:t>
+              <w:t>Predicciones, MSE, RMSE y R².</w:t>
             </w:r>
           </w:p>
         </w:tc>
@@ -5711,7 +6321,7 @@
               <w:rPr>
                 <w:sz w:val="19"/>
               </w:rPr>
-              <w:t>Sección V.</w:t>
+              <w:t>Sección IV.</w:t>
             </w:r>
           </w:p>
         </w:tc>
@@ -5729,6 +6339,63 @@
               <w:rPr>
                 <w:sz w:val="19"/>
               </w:rPr>
+              <w:t>Árbol</w:t>
+            </w:r>
+          </w:p>
+        </w:tc>
+        <w:tc>
+          <w:tcPr>
+            <w:tcW w:w="2578" w:type="dxa"/>
+          </w:tcPr>
+          <w:p>
+            <w:r>
+              <w:rPr>
+                <w:sz w:val="19"/>
+              </w:rPr>
+              <w:t>DecisionTreeRegressor(max_depth=8, min_samples_leaf=10)</w:t>
+            </w:r>
+          </w:p>
+        </w:tc>
+        <w:tc>
+          <w:tcPr>
+            <w:tcW w:w="2578" w:type="dxa"/>
+          </w:tcPr>
+          <w:p>
+            <w:r>
+              <w:rPr>
+                <w:sz w:val="19"/>
+              </w:rPr>
+              <w:t>Predicciones, importancias, MSE, RMSE y R².</w:t>
+            </w:r>
+          </w:p>
+        </w:tc>
+        <w:tc>
+          <w:tcPr>
+            <w:tcW w:w="2578" w:type="dxa"/>
+          </w:tcPr>
+          <w:p>
+            <w:r>
+              <w:rPr>
+                <w:sz w:val="19"/>
+              </w:rPr>
+              <w:t>Sección V.</w:t>
+            </w:r>
+          </w:p>
+        </w:tc>
+      </w:tr>
+      <w:tr>
+        <w:trPr>
+          <w:jc w:val="center"/>
+        </w:trPr>
+        <w:tc>
+          <w:tcPr>
+            <w:tcW w:w="2578" w:type="dxa"/>
+          </w:tcPr>
+          <w:p>
+            <w:r>
+              <w:rPr>
+                <w:sz w:val="19"/>
+              </w:rPr>
               <w:t>MLP</w:t>
             </w:r>
           </w:p>
@@ -5742,7 +6409,7 @@
               <w:rPr>
                 <w:sz w:val="19"/>
               </w:rPr>
-              <w:t>MLPRegressor(hidden_layer_sizes=(16,), alpha=1.0, early_stopping=True)</w:t>
+              <w:t>MLPRegressor(hidden_layer_sizes=(16,), alpha=0.01, early_stopping=True)</w:t>
             </w:r>
           </w:p>
         </w:tc>
@@ -6173,11 +6840,67 @@
         <w:spacing w:after="160"/>
       </w:pPr>
       <w:r>
-        <w:t xml:space="preserve">La Fase 2 permitió implementar un pipeline completo de regresión supervisada sobre el dataset AI Impact on Jobs 2030, retomando la línea de análisis complementaria identificada en la Fase 1. El proceso comenzó con la carga del conjunto de datos, la verificación de valores faltantes, la codificación de variables categóricas, la selección justificada de predictores (excluyendo variables con fuga de información), la partición </w:t>
-      </w:r>
-      <w:r>
         <w:lastRenderedPageBreak/>
-        <w:t>entrenamiento/prueba y el escalamiento de características. Estas acciones cumplen el preprocesamiento solicitado y permiten sostener que la comparación posterior se basa en un flujo analítico ordenado, reproducible y libre de fuga de información.</w:t>
+        <w:t xml:space="preserve">La Fase 2 permitió implementar un pipeline completo de regresión supervisada sobre el dataset AI Impact on Jobs 2030, retomando la línea de análisis complementaria identificada en la Fase 1. El preprocesamiento incluyó una </w:t>
+      </w:r>
+      <w:r>
+        <w:rPr>
+          <w:b/>
+        </w:rPr>
+        <w:t>iteración basada en evidencia</w:t>
+      </w:r>
+      <w:r>
+        <w:t xml:space="preserve">: una primera versión con 15 predictores numéricos/ordinales (excluyendo </w:t>
+      </w:r>
+      <w:r>
+        <w:rPr>
+          <w:rFonts w:ascii="Consolas" w:hAnsi="Consolas"/>
+          <w:sz w:val="20"/>
+        </w:rPr>
+        <w:t>Job_Title</w:t>
+      </w:r>
+      <w:r>
+        <w:t xml:space="preserve"> por ser nominal de 20 categorías) arrojó R² cercano a 0 en los tres modelos. Un análisis exploratorio adicional (sección 3.3) mostró que el promedio de </w:t>
+      </w:r>
+      <w:r>
+        <w:rPr>
+          <w:rFonts w:ascii="Consolas" w:hAnsi="Consolas"/>
+          <w:sz w:val="20"/>
+        </w:rPr>
+        <w:t>Automation_Probability_2030</w:t>
+      </w:r>
+      <w:r>
+        <w:t xml:space="preserve"> por </w:t>
+      </w:r>
+      <w:r>
+        <w:rPr>
+          <w:rFonts w:ascii="Consolas" w:hAnsi="Consolas"/>
+          <w:sz w:val="20"/>
+        </w:rPr>
+        <w:t>Job_Title</w:t>
+      </w:r>
+      <w:r>
+        <w:t xml:space="preserve"> explica por sí solo ~86% de la varianza de la variable objetivo, lo que motivó incorporar </w:t>
+      </w:r>
+      <w:r>
+        <w:rPr>
+          <w:rFonts w:ascii="Consolas" w:hAnsi="Consolas"/>
+          <w:sz w:val="20"/>
+        </w:rPr>
+        <w:t>Job_Title</w:t>
+      </w:r>
+      <w:r>
+        <w:t xml:space="preserve"> mediante codificación one-hot (19 dummies) al conjunto final de 34 predictores, manteniendo la exclusión justificada de </w:t>
+      </w:r>
+      <w:r>
+        <w:rPr>
+          <w:rFonts w:ascii="Consolas" w:hAnsi="Consolas"/>
+          <w:sz w:val="20"/>
+        </w:rPr>
+        <w:t>Risk_Category</w:t>
+      </w:r>
+      <w:r>
+        <w:t xml:space="preserve"> (fuga de información).</w:t>
       </w:r>
     </w:p>
     <w:p>
@@ -6185,7 +6908,44 @@
         <w:spacing w:after="160"/>
       </w:pPr>
       <w:r>
-        <w:t>Los tres modelos implementados —regresión lineal multivariable, árbol de decisión y red neuronal MLP— muestran un desempeño consistentemente bajo. La regresión lineal obtuvo MSE=0,0643 y R²=-0,0068; la red neuronal, MSE=0,0649 y R²=-0,0165; y el árbol de decisión, MSE=0,0652 y R²=-0,0216. Las diferencias entre modelos son marginales, y los tres se ubican en el mismo orden de magnitud que una predicción ingenua basada en el promedio de la variable objetivo (MSE≈0,0639).</w:t>
+        <w:t xml:space="preserve">Con </w:t>
+      </w:r>
+      <w:r>
+        <w:rPr>
+          <w:rFonts w:ascii="Consolas" w:hAnsi="Consolas"/>
+          <w:sz w:val="20"/>
+        </w:rPr>
+        <w:t>Job_Title</w:t>
+      </w:r>
+      <w:r>
+        <w:t xml:space="preserve"> incorporado, los tres modelos mejoraron drásticamente: </w:t>
+      </w:r>
+      <w:r>
+        <w:rPr>
+          <w:b/>
+        </w:rPr>
+        <w:t>Regresión Lineal</w:t>
+      </w:r>
+      <w:r>
+        <w:t xml:space="preserve"> (MSE=0,0087, RMSE=0,0933, R²=0,8638), </w:t>
+      </w:r>
+      <w:r>
+        <w:rPr>
+          <w:b/>
+        </w:rPr>
+        <w:t>Red Neuronal MLP</w:t>
+      </w:r>
+      <w:r>
+        <w:t xml:space="preserve"> (MSE=0,0098, RMSE=0,0988, R²=0,8470) y </w:t>
+      </w:r>
+      <w:r>
+        <w:rPr>
+          <w:b/>
+        </w:rPr>
+        <w:t>Árbol de Decisión</w:t>
+      </w:r>
+      <w:r>
+        <w:t xml:space="preserve"> (MSE=0,0186, RMSE=0,1366, R²=0,7079), todos muy por debajo del MSE de referencia de predecir el promedio (≈0,0639).</w:t>
       </w:r>
     </w:p>
     <w:p>
@@ -6199,31 +6959,40 @@
         <w:t>Conclusión comparativa:</w:t>
       </w:r>
       <w:r>
-        <w:t xml:space="preserve"> este resultado confirma cuantitativamente el diagnóstico cualitativo de la Fase 1 —las correlaciones lineales entre las variables de perfil laboral disponibles y </w:t>
+        <w:t xml:space="preserve"> la regresión lineal multivariable obtiene el mejor desempeño, seguida muy de cerca por la red neuronal; el árbol de decisión queda rezagado por la dificultad estructural de particionar 19 dummies binarias con una profundidad acotada. Que el modelo más simple iguale o supere a los más flexibles confirma que la relación dominante en los datos —probabilidad de automatización casi constante dentro de cada categoría de cargo— es esencialmente </w:t>
+      </w:r>
+      <w:r>
+        <w:rPr>
+          <w:b/>
+        </w:rPr>
+        <w:t>aditiva por categoría</w:t>
+      </w:r>
+      <w:r>
+        <w:t>, no una interacción no lineal compleja entre variables numéricas.</w:t>
+      </w:r>
+    </w:p>
+    <w:p>
+      <w:pPr>
+        <w:spacing w:after="160"/>
+      </w:pPr>
+      <w:r>
+        <w:rPr>
+          <w:b/>
+        </w:rPr>
+        <w:t>Implicancias para la continuidad del proyecto:</w:t>
+      </w:r>
+      <w:r>
+        <w:t xml:space="preserve"> para NextWork Advisory, </w:t>
       </w:r>
       <w:r>
         <w:rPr>
           <w:rFonts w:ascii="Consolas" w:hAnsi="Consolas"/>
           <w:sz w:val="20"/>
         </w:rPr>
-        <w:t>Automation_Probability_2030</w:t>
-      </w:r>
-      <w:r>
-        <w:t xml:space="preserve"> eran muy débiles— y lo extiende: ni siquiera modelos capaces de capturar relaciones no lineales (árbol de decisión, red neuronal) logran extraer señal predictiva relevante de estas variables en este dataset simulado. La regresión lineal, por su simplicidad e interpretabilidad, se recomienda como modelo de referencia mientras no exista evidencia de que la mayor complejidad de los otros dos modelos se traduzca en una mejora real de desempeño.</w:t>
-      </w:r>
-    </w:p>
-    <w:p>
-      <w:pPr>
-        <w:spacing w:after="160"/>
-      </w:pPr>
-      <w:r>
-        <w:rPr>
-          <w:b/>
-        </w:rPr>
-        <w:t>Implicancias para la continuidad del proyecto:</w:t>
-      </w:r>
-      <w:r>
-        <w:t xml:space="preserve"> para NextWork Advisory, este hallazgo es en sí mismo un resultado analítico relevante, no un fracaso del pipeline: indica que, con las variables actualmente disponibles, no es posible sustentar una recomendación de automatización basada en un modelo de regresión confiable. Como líneas de mejora para las fases siguientes (F3-F4) se identifican: (i) evaluar si </w:t>
+        <w:t>Job_Title</w:t>
+      </w:r>
+      <w:r>
+        <w:t xml:space="preserve"> es el predictor operativamente más útil del riesgo de automatización, muy por encima de salario, experiencia, educación, índices de exposición a IA o habilidades. Como líneas de mejora para las fases siguientes (F3-F4) se identifican: (i) validar la estabilidad de los coeficientes y del desempeño mediante validación cruzada (GridSearchCV/RandomizedSearchCV), dado que el dataset tiene solo ~120-175 observaciones por categoría de cargo; (ii) explorar Random Forest para el árbol de decisión, que maneja variables categóricas de forma más eficiente que un único árbol; (iii) evaluar si las 15 variables numéricas/ordinales aportan señal incremental dentro de cada categoría de cargo (interacciones Job_Title × variable numérica), en lugar de solo a nivel agregado; y (iv) dado que </w:t>
       </w:r>
       <w:r>
         <w:rPr>
@@ -6233,30 +7002,27 @@
         <w:t>Job_Title</w:t>
       </w:r>
       <w:r>
-        <w:t xml:space="preserve"> —excluido en esta fase— aporta señal predictiva relevante, incorporándolo mediante codificación one-hot o target encoding; (ii) explorar modelos adicionales sugeridos por el RA2 (Random Forest, SVR, regresión polinomial) para descartar definitivamente relaciones no lineales más complejas; (iii) ajustar hiperparámetros mediante validación cruzada (GridSearchCV/RandomizedSearchCV) en lugar de una configuración mínima fija; y (iv) —de persistir el bajo poder predictivo— reconsiderar si el enfoque de clasifica</w:t>
-      </w:r>
-      <w:r>
-        <w:t xml:space="preserve">ción sobre </w:t>
+        <w:t xml:space="preserve"> explica gran parte de la varianza tanto de </w:t>
       </w:r>
       <w:r>
         <w:rPr>
           <w:rFonts w:ascii="Consolas" w:hAnsi="Consolas"/>
           <w:sz w:val="20"/>
         </w:rPr>
-        <w:t>Risk_Category</w:t>
-      </w:r>
-      <w:r>
-        <w:t xml:space="preserve">, definido en la Fase 1, resulta más viable en la práctica que la regresión sobre </w:t>
+        <w:t>Automation_Probability_2030</w:t>
+      </w:r>
+      <w:r>
+        <w:t xml:space="preserve"> como de </w:t>
       </w:r>
       <w:r>
         <w:rPr>
           <w:rFonts w:ascii="Consolas" w:hAnsi="Consolas"/>
           <w:sz w:val="20"/>
         </w:rPr>
-        <w:t>Automation_Probability_2030</w:t>
-      </w:r>
-      <w:r>
-        <w:t>, dado que ambas variables comparten el mismo conjunto de predictores.</w:t>
+        <w:t>Risk_Category</w:t>
+      </w:r>
+      <w:r>
+        <w:t xml:space="preserve"> (Fase 1), comparar directamente el enfoque de regresión de esta fase con el de clasificación de la Fase 1 usando el mismo conjunto de predictores ampliado.</w:t>
       </w:r>
     </w:p>
     <w:p>
@@ -6452,10 +7218,10 @@
           <w:noProof/>
         </w:rPr>
         <w:drawing>
-          <wp:inline distT="0" distB="0" distL="0" distR="0" wp14:anchorId="296C67CA" wp14:editId="3ED66907">
+          <wp:inline distT="0" distB="0" distL="0" distR="0" wp14:anchorId="190A9E8F" wp14:editId="4771A087">
             <wp:extent cx="4572000" cy="2906643"/>
             <wp:effectExtent l="0" t="0" r="0" b="0"/>
-            <wp:docPr id="6" name="Picture 6"/>
+            <wp:docPr id="7" name="Picture 7"/>
             <wp:cNvGraphicFramePr>
               <a:graphicFrameLocks xmlns:a="http://schemas.openxmlformats.org/drawingml/2006/main" noChangeAspect="1"/>
             </wp:cNvGraphicFramePr>
@@ -6467,7 +7233,7 @@
                     <pic:cNvPicPr/>
                   </pic:nvPicPr>
                   <pic:blipFill>
-                    <a:blip r:embed="rId11"/>
+                    <a:blip r:embed="rId12"/>
                     <a:stretch>
                       <a:fillRect/>
                     </a:stretch>
@@ -6511,10 +7277,10 @@
           <w:noProof/>
         </w:rPr>
         <w:drawing>
-          <wp:inline distT="0" distB="0" distL="0" distR="0" wp14:anchorId="428817AC" wp14:editId="7A00EB10">
-            <wp:extent cx="4572000" cy="3223677"/>
+          <wp:inline distT="0" distB="0" distL="0" distR="0" wp14:anchorId="6D2826F1" wp14:editId="386AEBD4">
+            <wp:extent cx="4572000" cy="3075938"/>
             <wp:effectExtent l="0" t="0" r="0" b="0"/>
-            <wp:docPr id="7" name="Picture 7"/>
+            <wp:docPr id="8" name="Picture 8"/>
             <wp:cNvGraphicFramePr>
               <a:graphicFrameLocks xmlns:a="http://schemas.openxmlformats.org/drawingml/2006/main" noChangeAspect="1"/>
             </wp:cNvGraphicFramePr>
@@ -6526,7 +7292,7 @@
                     <pic:cNvPicPr/>
                   </pic:nvPicPr>
                   <pic:blipFill>
-                    <a:blip r:embed="rId12"/>
+                    <a:blip r:embed="rId13"/>
                     <a:stretch>
                       <a:fillRect/>
                     </a:stretch>
@@ -6534,7 +7300,7 @@
                   <pic:spPr>
                     <a:xfrm>
                       <a:off x="0" y="0"/>
-                      <a:ext cx="4572000" cy="3223677"/>
+                      <a:ext cx="4572000" cy="3075938"/>
                     </a:xfrm>
                     <a:prstGeom prst="rect">
                       <a:avLst/>
@@ -6571,10 +7337,10 @@
         </w:rPr>
         <w:lastRenderedPageBreak/>
         <w:drawing>
-          <wp:inline distT="0" distB="0" distL="0" distR="0" wp14:anchorId="1046ACE4" wp14:editId="026365D9">
+          <wp:inline distT="0" distB="0" distL="0" distR="0" wp14:anchorId="78E5FCA7" wp14:editId="2A1A8E4D">
             <wp:extent cx="4572000" cy="3236112"/>
             <wp:effectExtent l="0" t="0" r="0" b="0"/>
-            <wp:docPr id="8" name="Picture 8"/>
+            <wp:docPr id="9" name="Picture 9"/>
             <wp:cNvGraphicFramePr>
               <a:graphicFrameLocks xmlns:a="http://schemas.openxmlformats.org/drawingml/2006/main" noChangeAspect="1"/>
             </wp:cNvGraphicFramePr>
@@ -6586,7 +7352,7 @@
                     <pic:cNvPicPr/>
                   </pic:nvPicPr>
                   <pic:blipFill>
-                    <a:blip r:embed="rId13"/>
+                    <a:blip r:embed="rId14"/>
                     <a:stretch>
                       <a:fillRect/>
                     </a:stretch>
@@ -6630,10 +7396,10 @@
           <w:noProof/>
         </w:rPr>
         <w:drawing>
-          <wp:inline distT="0" distB="0" distL="0" distR="0" wp14:anchorId="3A46E018" wp14:editId="4C0FBD48">
-            <wp:extent cx="4572000" cy="2906643"/>
+          <wp:inline distT="0" distB="0" distL="0" distR="0" wp14:anchorId="57D1EE92" wp14:editId="2BBA45A3">
+            <wp:extent cx="4572000" cy="2915093"/>
             <wp:effectExtent l="0" t="0" r="0" b="0"/>
-            <wp:docPr id="9" name="Picture 9"/>
+            <wp:docPr id="10" name="Picture 10"/>
             <wp:cNvGraphicFramePr>
               <a:graphicFrameLocks xmlns:a="http://schemas.openxmlformats.org/drawingml/2006/main" noChangeAspect="1"/>
             </wp:cNvGraphicFramePr>
@@ -6645,7 +7411,7 @@
                     <pic:cNvPicPr/>
                   </pic:nvPicPr>
                   <pic:blipFill>
-                    <a:blip r:embed="rId14"/>
+                    <a:blip r:embed="rId15"/>
                     <a:stretch>
                       <a:fillRect/>
                     </a:stretch>
@@ -6653,7 +7419,7 @@
                   <pic:spPr>
                     <a:xfrm>
                       <a:off x="0" y="0"/>
-                      <a:ext cx="4572000" cy="2906643"/>
+                      <a:ext cx="4572000" cy="2915093"/>
                     </a:xfrm>
                     <a:prstGeom prst="rect">
                       <a:avLst/>
@@ -6709,7 +7475,7 @@
         <w:rPr>
           <w:b/>
         </w:rPr>
-        <w:t>Preparación de datos</w:t>
+        <w:t>Exploración de Job_Title</w:t>
       </w:r>
     </w:p>
     <w:p>
@@ -6722,7 +7488,7 @@
           <w:rFonts w:ascii="Consolas" w:hAnsi="Consolas"/>
           <w:sz w:val="18"/>
         </w:rPr>
-        <w:t>orden_educacion = {"High School": 1, "Bachelor's": 2, "Master's": 3, "PhD": 4}</w:t>
+        <w:t>medias_por_cargo = df.groupby("Job_Title")["Automation_Probability_2030"].mean()</w:t>
       </w:r>
       <w:r>
         <w:rPr>
@@ -6730,7 +7496,7 @@
           <w:sz w:val="18"/>
         </w:rPr>
         <w:br/>
-        <w:t>df["Education_Level_Num"] = df["Education_Level"].map(orden_educacion)</w:t>
+        <w:t>medias_por_fila = df.groupby("Job_Title")["Automation_Probability_2030"].transform("mean")</w:t>
       </w:r>
       <w:r>
         <w:rPr>
@@ -6738,7 +7504,7 @@
           <w:sz w:val="18"/>
         </w:rPr>
         <w:br/>
-        <w:t>X = df[variables_predictoras]</w:t>
+        <w:t>ss_entre_grupos = ((medias_por_fila - df["Automation_Probability_2030"].mean()) ** 2).sum()</w:t>
       </w:r>
       <w:r>
         <w:rPr>
@@ -6746,19 +7512,78 @@
           <w:sz w:val="18"/>
         </w:rPr>
         <w:br/>
+        <w:t>ss_total = ((df["Automation_Probability_2030"] - df["Automation_Probability_2030"].mean()) ** 2).sum()</w:t>
       </w:r>
       <w:r>
         <w:rPr>
           <w:rFonts w:ascii="Consolas" w:hAnsi="Consolas"/>
           <w:sz w:val="18"/>
         </w:rPr>
-        <w:t>y = df["Automation_Probability_2030"]</w:t>
-      </w:r>
+        <w:br/>
+        <w:t>r2_agrupacion = ss_entre_grupos / ss_total  # ~0.857</w:t>
+      </w:r>
+    </w:p>
+    <w:p>
+      <w:pPr>
+        <w:spacing w:before="120" w:after="40"/>
+      </w:pPr>
+      <w:r>
+        <w:rPr>
+          <w:b/>
+        </w:rPr>
+        <w:lastRenderedPageBreak/>
+        <w:t>Preparación de datos</w:t>
+      </w:r>
+    </w:p>
+    <w:p>
+      <w:pPr>
+        <w:shd w:val="clear" w:color="auto" w:fill="F2F2F2"/>
+        <w:spacing w:after="160"/>
+      </w:pPr>
       <w:r>
         <w:rPr>
           <w:rFonts w:ascii="Consolas" w:hAnsi="Consolas"/>
           <w:sz w:val="18"/>
         </w:rPr>
+        <w:t>orden_educacion = {"High School": 1, "Bachelor's": 2, "Master's": 3, "PhD": 4}</w:t>
+      </w:r>
+      <w:r>
+        <w:rPr>
+          <w:rFonts w:ascii="Consolas" w:hAnsi="Consolas"/>
+          <w:sz w:val="18"/>
+        </w:rPr>
+        <w:br/>
+        <w:t>df["Education_Level_Num"] = df["Education_Level"].map(orden_educacion)</w:t>
+      </w:r>
+      <w:r>
+        <w:rPr>
+          <w:rFonts w:ascii="Consolas" w:hAnsi="Consolas"/>
+          <w:sz w:val="18"/>
+        </w:rPr>
+        <w:br/>
+        <w:t>job_title_dummies = pd.get_dummies(df["Job_Title"], prefix="Job_Title", drop_first=True).astype(int)</w:t>
+      </w:r>
+      <w:r>
+        <w:rPr>
+          <w:rFonts w:ascii="Consolas" w:hAnsi="Consolas"/>
+          <w:sz w:val="18"/>
+        </w:rPr>
+        <w:br/>
+        <w:t>X = pd.concat([df[variables_numericas], job_title_dummies], axis=1)</w:t>
+      </w:r>
+      <w:r>
+        <w:rPr>
+          <w:rFonts w:ascii="Consolas" w:hAnsi="Consolas"/>
+          <w:sz w:val="18"/>
+        </w:rPr>
+        <w:br/>
+        <w:t>y = df["Automation_Probability_2030"]</w:t>
+      </w:r>
+      <w:r>
+        <w:rPr>
+          <w:rFonts w:ascii="Consolas" w:hAnsi="Consolas"/>
+          <w:sz w:val="18"/>
+        </w:rPr>
         <w:br/>
         <w:t>X_train, X_test, y_train, y_test = train_test_split(</w:t>
       </w:r>
@@ -6768,14 +7593,15 @@
           <w:sz w:val="18"/>
         </w:rPr>
         <w:br/>
+        <w:t xml:space="preserve">    X, y, test_size=0.20, random_state=42)</w:t>
       </w:r>
       <w:r>
         <w:rPr>
           <w:rFonts w:ascii="Consolas" w:hAnsi="Consolas"/>
           <w:sz w:val="18"/>
         </w:rPr>
-        <w:lastRenderedPageBreak/>
-        <w:t xml:space="preserve">    X, y, test_size=0.20, random_state=42)</w:t>
+        <w:br/>
+        <w:t>scaler = StandardScaler().fit(X_train)</w:t>
       </w:r>
       <w:r>
         <w:rPr>
@@ -6783,7 +7609,7 @@
           <w:sz w:val="18"/>
         </w:rPr>
         <w:br/>
-        <w:t>scaler = StandardScaler().fit(X_train)</w:t>
+        <w:t>X_train_scaled = scaler.transform(X_train)</w:t>
       </w:r>
       <w:r>
         <w:rPr>
@@ -6791,15 +7617,71 @@
           <w:sz w:val="18"/>
         </w:rPr>
         <w:br/>
-        <w:t>X_train_scaled = scaler.transform(X_train)</w:t>
-      </w:r>
+        <w:t>X_test_scaled = scaler.transform(X_test)</w:t>
+      </w:r>
+    </w:p>
+    <w:p>
+      <w:pPr>
+        <w:spacing w:before="120" w:after="40"/>
+      </w:pPr>
+      <w:r>
+        <w:rPr>
+          <w:b/>
+        </w:rPr>
+        <w:t>Regresión lineal</w:t>
+      </w:r>
+    </w:p>
+    <w:p>
+      <w:pPr>
+        <w:shd w:val="clear" w:color="auto" w:fill="F2F2F2"/>
+        <w:spacing w:after="160"/>
+      </w:pPr>
       <w:r>
         <w:rPr>
           <w:rFonts w:ascii="Consolas" w:hAnsi="Consolas"/>
           <w:sz w:val="18"/>
         </w:rPr>
+        <w:t>linear_model = LinearRegression()</w:t>
+      </w:r>
+      <w:r>
+        <w:rPr>
+          <w:rFonts w:ascii="Consolas" w:hAnsi="Consolas"/>
+          <w:sz w:val="18"/>
+        </w:rPr>
         <w:br/>
-        <w:t>X_test_scaled = scaler.transform(X_test)</w:t>
+        <w:t>linear_model.fit(X_train_scaled, y_train)</w:t>
+      </w:r>
+      <w:r>
+        <w:rPr>
+          <w:rFonts w:ascii="Consolas" w:hAnsi="Consolas"/>
+          <w:sz w:val="18"/>
+        </w:rPr>
+        <w:br/>
+        <w:t>y_pred_linear = linear_model.predict(X_test_scaled)</w:t>
+      </w:r>
+      <w:r>
+        <w:rPr>
+          <w:rFonts w:ascii="Consolas" w:hAnsi="Consolas"/>
+          <w:sz w:val="18"/>
+        </w:rPr>
+        <w:br/>
+        <w:t>mse_linear = mean_squared_error(y_test, y_pred_linear)</w:t>
+      </w:r>
+      <w:r>
+        <w:rPr>
+          <w:rFonts w:ascii="Consolas" w:hAnsi="Consolas"/>
+          <w:sz w:val="18"/>
+        </w:rPr>
+        <w:br/>
+        <w:t>rmse_linear = np.sqrt(mse_linear)</w:t>
+      </w:r>
+      <w:r>
+        <w:rPr>
+          <w:rFonts w:ascii="Consolas" w:hAnsi="Consolas"/>
+          <w:sz w:val="18"/>
+        </w:rPr>
+        <w:br/>
+        <w:t>r2_linear = r2_score(y_test, y_pred_linear)</w:t>
       </w:r>
     </w:p>
     <w:p>
@@ -6810,7 +7692,7 @@
         <w:rPr>
           <w:b/>
         </w:rPr>
-        <w:t>Regresión lineal</w:t>
+        <w:t>Árbol de decisión</w:t>
       </w:r>
     </w:p>
     <w:p>
@@ -6823,7 +7705,7 @@
           <w:rFonts w:ascii="Consolas" w:hAnsi="Consolas"/>
           <w:sz w:val="18"/>
         </w:rPr>
-        <w:t>linear_model = LinearRegression()</w:t>
+        <w:t>decision_tree_model = DecisionTreeRegressor(max_depth=8, min_samples_leaf=10, random_state=42)</w:t>
       </w:r>
       <w:r>
         <w:rPr>
@@ -6831,7 +7713,7 @@
           <w:sz w:val="18"/>
         </w:rPr>
         <w:br/>
-        <w:t>linear_model.fit(X_train_scaled, y_train)</w:t>
+        <w:t>decision_tree_model.fit(X_train_scaled, y_train)</w:t>
       </w:r>
       <w:r>
         <w:rPr>
@@ -6839,15 +7721,31 @@
           <w:sz w:val="18"/>
         </w:rPr>
         <w:br/>
-        <w:t>y_pred_linear = linear_model.predict(X_test_scaled)</w:t>
-      </w:r>
+        <w:t>y_pred_tree = decision_tree_model.predict(X_test_scaled)</w:t>
+      </w:r>
+    </w:p>
+    <w:p>
+      <w:pPr>
+        <w:spacing w:before="120" w:after="40"/>
+      </w:pPr>
+      <w:r>
+        <w:rPr>
+          <w:b/>
+        </w:rPr>
+        <w:t>Red neuronal MLP</w:t>
+      </w:r>
+    </w:p>
+    <w:p>
+      <w:pPr>
+        <w:shd w:val="clear" w:color="auto" w:fill="F2F2F2"/>
+        <w:spacing w:after="160"/>
+      </w:pPr>
       <w:r>
         <w:rPr>
           <w:rFonts w:ascii="Consolas" w:hAnsi="Consolas"/>
           <w:sz w:val="18"/>
         </w:rPr>
-        <w:br/>
-        <w:t>mse_linear = mean_squared_error(y_test, y_pred_linear)</w:t>
+        <w:t>mlp_model = MLPRegressor(hidden_layer_sizes=(16,), activation="relu", solver="adam",</w:t>
       </w:r>
       <w:r>
         <w:rPr>
@@ -6855,7 +7753,7 @@
           <w:sz w:val="18"/>
         </w:rPr>
         <w:br/>
-        <w:t>rmse_linear = np.sqrt(mse_linear)</w:t>
+        <w:t xml:space="preserve">                         alpha=0.01, max_iter=1000, random_state=42, early_stopping=True)</w:t>
       </w:r>
       <w:r>
         <w:rPr>
@@ -6863,106 +7761,14 @@
           <w:sz w:val="18"/>
         </w:rPr>
         <w:br/>
+        <w:t>mlp_model.fit(X_train_scaled, y_train)</w:t>
       </w:r>
       <w:r>
         <w:rPr>
           <w:rFonts w:ascii="Consolas" w:hAnsi="Consolas"/>
           <w:sz w:val="18"/>
         </w:rPr>
-        <w:t>r2_linear = r2_score(y_test, y_pred_linear)</w:t>
-      </w:r>
-    </w:p>
-    <w:p>
-      <w:pPr>
-        <w:spacing w:before="120" w:after="40"/>
-      </w:pPr>
-      <w:r>
-        <w:rPr>
-          <w:b/>
-        </w:rPr>
-        <w:t>Árbol de decisión</w:t>
-      </w:r>
-    </w:p>
-    <w:p>
-      <w:pPr>
-        <w:shd w:val="clear" w:color="auto" w:fill="F2F2F2"/>
-        <w:spacing w:after="160"/>
-      </w:pPr>
-      <w:r>
-        <w:rPr>
-          <w:rFonts w:ascii="Consolas" w:hAnsi="Consolas"/>
-          <w:sz w:val="18"/>
-        </w:rPr>
-        <w:t>decision_tree_model = DecisionTreeRegressor(max_depth=3, min_samples_leaf=30, random_state=42)</w:t>
-      </w:r>
-      <w:r>
-        <w:rPr>
-          <w:rFonts w:ascii="Consolas" w:hAnsi="Consolas"/>
-          <w:sz w:val="18"/>
-        </w:rPr>
         <w:br/>
-        <w:t>decision_tree_model.fit(X_train_scaled, y_train)</w:t>
-      </w:r>
-      <w:r>
-        <w:rPr>
-          <w:rFonts w:ascii="Consolas" w:hAnsi="Consolas"/>
-          <w:sz w:val="18"/>
-        </w:rPr>
-        <w:br/>
-        <w:t>y_pred_tree = decision_tree_model.predict(X_test_scaled)</w:t>
-      </w:r>
-    </w:p>
-    <w:p>
-      <w:pPr>
-        <w:spacing w:before="120" w:after="40"/>
-      </w:pPr>
-      <w:r>
-        <w:rPr>
-          <w:b/>
-        </w:rPr>
-        <w:t>Red neuronal MLP</w:t>
-      </w:r>
-    </w:p>
-    <w:p>
-      <w:pPr>
-        <w:shd w:val="clear" w:color="auto" w:fill="F2F2F2"/>
-        <w:spacing w:after="160"/>
-      </w:pPr>
-      <w:r>
-        <w:rPr>
-          <w:rFonts w:ascii="Consolas" w:hAnsi="Consolas"/>
-          <w:sz w:val="18"/>
-        </w:rPr>
-        <w:t>mlp_model = MLPRegressor(hidden_layer_sizes=(16,), activation="relu", solver="adam",</w:t>
-      </w:r>
-      <w:r>
-        <w:rPr>
-          <w:rFonts w:ascii="Consolas" w:hAnsi="Consolas"/>
-          <w:sz w:val="18"/>
-        </w:rPr>
-        <w:br/>
-        <w:t xml:space="preserve">                         alpha=1.0, max_iter=1000, random_state=42, early_stopping=True)</w:t>
-      </w:r>
-      <w:r>
-        <w:rPr>
-          <w:rFonts w:ascii="Consolas" w:hAnsi="Consolas"/>
-          <w:sz w:val="18"/>
-        </w:rPr>
-        <w:br/>
-        <w:t>mlp_model.fit(X_train_scaled, y_train)</w:t>
-      </w:r>
-      <w:r>
-        <w:rPr>
-          <w:rFonts w:ascii="Consolas" w:hAnsi="Consolas"/>
-          <w:sz w:val="18"/>
-        </w:rPr>
-        <w:br/>
-      </w:r>
-      <w:r>
-        <w:rPr>
-          <w:rFonts w:ascii="Consolas" w:hAnsi="Consolas"/>
-          <w:sz w:val="18"/>
-        </w:rPr>
         <w:t>y_pred_mlp = mlp_model.predict(X_test_scaled)</w:t>
       </w:r>
     </w:p>
@@ -7583,6 +8389,7 @@
         <w:spacing w:after="160"/>
       </w:pPr>
       <w:r>
+        <w:lastRenderedPageBreak/>
         <w:t xml:space="preserve">Nota final: antes de entregar, el equipo debe revisar la ortografía y numeración del documento, confirmar que el notebook </w:t>
       </w:r>
       <w:r>
@@ -7779,31 +8586,31 @@
       </w:rPr>
     </w:lvl>
   </w:abstractNum>
-  <w:num w:numId="1" w16cid:durableId="1205752192">
+  <w:num w:numId="1" w16cid:durableId="1236627016">
     <w:abstractNumId w:val="8"/>
   </w:num>
-  <w:num w:numId="2" w16cid:durableId="789130599">
+  <w:num w:numId="2" w16cid:durableId="1832914319">
     <w:abstractNumId w:val="6"/>
   </w:num>
-  <w:num w:numId="3" w16cid:durableId="119954177">
+  <w:num w:numId="3" w16cid:durableId="1989437184">
     <w:abstractNumId w:val="5"/>
   </w:num>
-  <w:num w:numId="4" w16cid:durableId="1603686979">
+  <w:num w:numId="4" w16cid:durableId="1419867737">
     <w:abstractNumId w:val="4"/>
   </w:num>
-  <w:num w:numId="5" w16cid:durableId="1830561301">
+  <w:num w:numId="5" w16cid:durableId="254486884">
     <w:abstractNumId w:val="7"/>
   </w:num>
-  <w:num w:numId="6" w16cid:durableId="511993093">
+  <w:num w:numId="6" w16cid:durableId="1998218292">
     <w:abstractNumId w:val="3"/>
   </w:num>
-  <w:num w:numId="7" w16cid:durableId="795022265">
+  <w:num w:numId="7" w16cid:durableId="1588418412">
     <w:abstractNumId w:val="2"/>
   </w:num>
-  <w:num w:numId="8" w16cid:durableId="485323065">
+  <w:num w:numId="8" w16cid:durableId="1422526721">
     <w:abstractNumId w:val="1"/>
   </w:num>
-  <w:num w:numId="9" w16cid:durableId="340473690">
+  <w:num w:numId="9" w16cid:durableId="788625133">
     <w:abstractNumId w:val="0"/>
   </w:num>
 </w:numbering>

</xml_diff>